<commit_message>
Update Springer manuscript v2 and add PDF export
</commit_message>
<xml_diff>
--- a/manuscript/VITAL_Q_Manuscript_Springer_v2.docx
+++ b/manuscript/VITAL_Q_Manuscript_Springer_v2.docx
@@ -8,7 +8,6 @@
         <w:jc w:val="center"/>
       </w:pPr>
       <w:r>
-        <w:rPr/>
         <w:t>Predicting Verification Latency for Post-Quantum Archival Evidence</w:t>
       </w:r>
     </w:p>
@@ -71,8 +70,8 @@
       <w:r>
         <w:rPr>
           <w:b/>
+          <w:sz w:val="24"/>
           <w:vertAlign w:val="superscript"/>
-          <w:sz w:val="24"/>
         </w:rPr>
         <w:t>4*†</w:t>
       </w:r>
@@ -137,8 +136,8 @@
       </w:pPr>
       <w:r>
         <w:rPr>
+          <w:sz w:val="22"/>
           <w:vertAlign w:val="superscript"/>
-          <w:sz w:val="22"/>
         </w:rPr>
         <w:t>4</w:t>
       </w:r>
@@ -158,17 +157,6 @@
           <w:sz w:val="18"/>
         </w:rPr>
         <w:t>*Corresponding author(s). E-mail(s): arindamc.81@gmail.com; discoversaikatchakraborty@gmail.com; sohammarik63@gmail.com; Sammy10692@gmail.com</w:t>
-      </w:r>
-    </w:p>
-    <w:p>
-      <w:pPr>
-        <w:jc w:val="center"/>
-      </w:pPr>
-      <w:r>
-        <w:rPr>
-          <w:sz w:val="18"/>
-        </w:rPr>
-        <w:t>†These authors contributed equally to this work.</w:t>
       </w:r>
     </w:p>
     <w:p>
@@ -216,7 +204,6 @@
     <w:p>
       <w:pPr>
         <w:pStyle w:val="Heading1"/>
-        <w:keepNext/>
       </w:pPr>
       <w:r>
         <w:t>1 Introduction</w:t>
@@ -224,8 +211,11 @@
     </w:p>
     <w:p>
       <w:r>
-        <w:rPr/>
-        <w:t>Long-lived evidence must remain verifiable as signing keys and algorithms change. Evidence Record Syntax and its XML form already describe renewal chains and tree-based aggregation [1], [2]. Post-quantum signature standards provide additional choices for signing those records [3], [4]. The operational question addressed here is narrower: can a model calibrated on small archives predict the latency of verifying a complete request against a larger archive? Signature counts alone do not capture verification latency. The verifier also parses evidence, validates canonical manifests, binds the proof to the caller's request, checks enrollment and predecessor links, reconstructs the tree path and applies the historical eligibility policy.</w:t>
+        <w:t xml:space="preserve">Long-lived evidence must remain verifiable as signing keys and algorithms change. Evidence Record Syntax and its XML form already describe renewal chains and tree-based aggregation [1], [2]. Post-quantum signature standards provide additional choices for signing those records [3], [4]. The operational question addressed here is narrower: can a model calibrated on small archives predict the latency of verifying a complete request against a larger archive? Signature counts alone do not capture verification latency. The verifier also parses evidence, validates canonical manifests, binds the proof to the caller's </w:t>
+      </w:r>
+      <w:r>
+        <w:lastRenderedPageBreak/>
+        <w:t>request, checks enrollment and predecessor links, reconstructs the tree path and applies the historical eligibility policy.</w:t>
       </w:r>
     </w:p>
     <w:p>
@@ -235,14 +225,12 @@
     </w:p>
     <w:p>
       <w:r>
-        <w:rPr/>
         <w:t>This study contributes a prospectively frozen, validation-aware model of complete-query verification cost, tested at a tenfold increase in archive size against equally trained baselines and assessed for whether the result persists when each query runs in a fresh process. A corrected timer and balanced query order define the measurement protocol. The cryptographic primitives, batching method and renewal concept are established techniques. The manuscript makes no claim to a new cryptographic construction.</w:t>
       </w:r>
     </w:p>
     <w:p>
       <w:pPr>
         <w:pStyle w:val="Heading1"/>
-        <w:keepNext/>
       </w:pPr>
       <w:r>
         <w:t>2 Related work</w:t>
@@ -260,14 +248,12 @@
     </w:p>
     <w:p>
       <w:r>
-        <w:rPr/>
         <w:t>Kao’s preprint studies post-quantum audit evidence, migration patterns and Merkle-root anchoring [6]. The individual Wathiqa Internet-Draft proposes an algorithm-agile evidence-record profile [7]. These works describe post-quantum renewal and aggregation for evidence preservation; they do not report the prospective, complete-query latency extrapolation evaluated here. PROV-DM supplies a broader vocabulary for artifact provenance [8]; signed manifests can protect recorded references while leaving the truth of source acquisition outside the verifier’s scope.</w:t>
       </w:r>
     </w:p>
     <w:p>
       <w:pPr>
         <w:pStyle w:val="Heading1"/>
-        <w:keepNext/>
       </w:pPr>
       <w:r>
         <w:t>3 Materials and methods</w:t>
@@ -276,7 +262,6 @@
     <w:p>
       <w:pPr>
         <w:pStyle w:val="Heading2"/>
-        <w:keepNext/>
       </w:pPr>
       <w:r>
         <w:t>3.1 Evidence designs and verification contract</w:t>
@@ -346,7 +331,6 @@
           </w:tcPr>
           <w:p>
             <w:pPr>
-              <w:keepNext w:val="0"/>
               <w:spacing w:after="20" w:line="240" w:lineRule="auto"/>
             </w:pPr>
             <w:r>
@@ -372,7 +356,6 @@
           </w:tcPr>
           <w:p>
             <w:pPr>
-              <w:keepNext w:val="0"/>
               <w:spacing w:after="20" w:line="240" w:lineRule="auto"/>
               <w:jc w:val="center"/>
             </w:pPr>
@@ -399,7 +382,6 @@
           </w:tcPr>
           <w:p>
             <w:pPr>
-              <w:keepNext w:val="0"/>
               <w:spacing w:after="20" w:line="240" w:lineRule="auto"/>
               <w:jc w:val="center"/>
             </w:pPr>
@@ -426,7 +408,6 @@
           </w:tcPr>
           <w:p>
             <w:pPr>
-              <w:keepNext w:val="0"/>
               <w:spacing w:after="20" w:line="240" w:lineRule="auto"/>
               <w:jc w:val="center"/>
             </w:pPr>
@@ -459,7 +440,6 @@
           </w:tcPr>
           <w:p>
             <w:pPr>
-              <w:keepNext w:val="0"/>
               <w:spacing w:after="20" w:line="240" w:lineRule="auto"/>
             </w:pPr>
             <w:r>
@@ -484,7 +464,6 @@
           </w:tcPr>
           <w:p>
             <w:pPr>
-              <w:keepNext w:val="0"/>
               <w:spacing w:after="20" w:line="240" w:lineRule="auto"/>
               <w:jc w:val="center"/>
             </w:pPr>
@@ -510,7 +489,6 @@
           </w:tcPr>
           <w:p>
             <w:pPr>
-              <w:keepNext w:val="0"/>
               <w:spacing w:after="20" w:line="240" w:lineRule="auto"/>
               <w:jc w:val="center"/>
             </w:pPr>
@@ -536,7 +514,6 @@
           </w:tcPr>
           <w:p>
             <w:pPr>
-              <w:keepNext w:val="0"/>
               <w:spacing w:after="20" w:line="240" w:lineRule="auto"/>
               <w:jc w:val="center"/>
             </w:pPr>
@@ -568,7 +545,6 @@
           </w:tcPr>
           <w:p>
             <w:pPr>
-              <w:keepNext w:val="0"/>
               <w:spacing w:after="20" w:line="240" w:lineRule="auto"/>
             </w:pPr>
             <w:r>
@@ -593,7 +569,6 @@
           </w:tcPr>
           <w:p>
             <w:pPr>
-              <w:keepNext w:val="0"/>
               <w:spacing w:after="20" w:line="240" w:lineRule="auto"/>
               <w:jc w:val="center"/>
             </w:pPr>
@@ -619,7 +594,6 @@
           </w:tcPr>
           <w:p>
             <w:pPr>
-              <w:keepNext w:val="0"/>
               <w:spacing w:after="20" w:line="240" w:lineRule="auto"/>
               <w:jc w:val="center"/>
             </w:pPr>
@@ -645,7 +619,6 @@
           </w:tcPr>
           <w:p>
             <w:pPr>
-              <w:keepNext w:val="0"/>
               <w:spacing w:after="20" w:line="240" w:lineRule="auto"/>
               <w:jc w:val="center"/>
             </w:pPr>
@@ -677,7 +650,6 @@
           </w:tcPr>
           <w:p>
             <w:pPr>
-              <w:keepNext w:val="0"/>
               <w:spacing w:after="20" w:line="240" w:lineRule="auto"/>
             </w:pPr>
             <w:r>
@@ -702,7 +674,6 @@
           </w:tcPr>
           <w:p>
             <w:pPr>
-              <w:keepNext w:val="0"/>
               <w:spacing w:after="20" w:line="240" w:lineRule="auto"/>
               <w:jc w:val="center"/>
             </w:pPr>
@@ -728,7 +699,6 @@
           </w:tcPr>
           <w:p>
             <w:pPr>
-              <w:keepNext w:val="0"/>
               <w:spacing w:after="20" w:line="240" w:lineRule="auto"/>
               <w:jc w:val="center"/>
             </w:pPr>
@@ -754,7 +724,6 @@
           </w:tcPr>
           <w:p>
             <w:pPr>
-              <w:keepNext w:val="0"/>
               <w:spacing w:after="20" w:line="240" w:lineRule="auto"/>
               <w:jc w:val="center"/>
             </w:pPr>
@@ -779,22 +748,18 @@
         </w:rPr>
       </w:pPr>
       <w:r>
-        <w:rPr/>
         <w:t>Here k = ceil(n/4096). N and E begin with ECDSA P-256 and use ML-DSA-65 for subsequent generations. D adds a parallel SHA-384 tree and SLH-DSA SHA2-192f branch. Later key rotations within a branch retain that branch’s signature family; this does not constitute hash-family renewal. The verifier accepts the requested checkpoint, query mode and record identifier as external inputs. It rejects proofs for a different request even if their internal signatures are valid. A full audit checks all manifest and token evidence required by the selected checkpoint. A selective query checks one requested record and its inclusion path where required. The trust model assumes honest public-key enrollment and a modeled local clock. The policy checks whether an eligible branch spans the requested history. One healthy branch can satisfy the D policy after a modeled failure of the other signature family. Compromised acquisition, dishonest enrollment, shared administrative failures, simultaneous failure of both branches and hash-family failure remain outside that claim.</w:t>
       </w:r>
     </w:p>
     <w:p>
       <w:pPr>
         <w:pStyle w:val="Heading3"/>
-        <w:keepNext/>
         <w:spacing w:after="100"/>
       </w:pPr>
       <w:r>
         <w:rPr>
           <w:rFonts w:ascii="Times New Roman" w:hAnsi="Times New Roman"/>
-          <w:b/>
           <w:color w:val="000000"/>
-          <w:sz w:val="20"/>
         </w:rPr>
         <w:t>3.1.1 Trusted enrollment and archival trust</w:t>
       </w:r>
@@ -804,10 +769,6 @@
         <w:spacing w:after="100"/>
       </w:pPr>
       <w:r>
-        <w:rPr>
-          <w:rFonts w:ascii="Times New Roman" w:hAnsi="Times New Roman"/>
-          <w:sz w:val="20"/>
-        </w:rPr>
         <w:t>Trusted enrollment is an external assumption: the caller supplies the expected public keys and their authorized association with each history, branch and generation. Verifying agreement with that policy does not establish the enrolling party’s real-world identity or the honesty of enrollment. An attacker who controls the trusted policy is outside the qualification claim.</w:t>
       </w:r>
     </w:p>
@@ -816,10 +777,6 @@
         <w:spacing w:after="100"/>
       </w:pPr>
       <w:r>
-        <w:rPr>
-          <w:rFonts w:ascii="Times New Roman" w:hAnsi="Times New Roman"/>
-          <w:sz w:val="20"/>
-        </w:rPr>
         <w:t>The modeled epoch and generation times test ordering and eligibility. A signature authenticates the asserted time value; it does not establish when the event occurred. RFC 3161 requires a timestamp authority to use a trustworthy time source [12]. This prototype supplies no such timestamp evidence.</w:t>
       </w:r>
     </w:p>
@@ -828,17 +785,12 @@
         <w:spacing w:after="100"/>
       </w:pPr>
       <w:r>
-        <w:rPr>
-          <w:rFonts w:ascii="Times New Roman" w:hAnsi="Times New Roman"/>
-          <w:sz w:val="20"/>
-        </w:rPr>
         <w:t>Verification correctness means that the evidence satisfies the implemented request, structure, signature and policy checks under these assumptions. Long-term archival trust additionally depends on trustworthy acquisition, key custody, authentic enrollment, retained validation evidence and timely renewal. ERS identifies certificates, revocation information, trust anchors and policy details as relevant verification material [1]. The 233 qualification checks do not establish these operational assurances. Distinct signature families in D do not make shared enrollment or administrative failures independent and a surviving eligible branch cannot repair compromised source evidence.</w:t>
       </w:r>
     </w:p>
     <w:p>
       <w:pPr>
         <w:pStyle w:val="Heading2"/>
-        <w:keepNext/>
       </w:pPr>
       <w:r>
         <w:t>3.2 Diagnosis and measurement correction</w:t>
@@ -855,11 +807,12 @@
         </w:rPr>
       </w:pPr>
       <w:r>
-        <w:rPr/>
-        <w:t>In the original helper, the statement result = verify_proof(...) could allow disposal of the previously returned result during the next timed call. The revised helper assigns the return value to a fresh local variable, stops the timer immediately after verification returns and performs assertions and disposal afterward. A regression test records destructor and clock events and requires disposal to follow the stop clock for every call. A second test requires the previous returned object to be absent before the next call. The regression tests establish the revised timer boundary; they do not quantify how much of the earlier prediction error was caused by result disposal. The ordinary verifier returns counts and eligibility flags with an empty manifest list.</w:t>
+        <w:t xml:space="preserve">In the original helper, the statement result = verify_proof(...) could allow disposal of the previously returned result during the next timed call. The revised helper assigns the return value to a fresh local variable, stops the timer immediately after verification returns and performs assertions and disposal afterward. A regression test records destructor and clock events and requires disposal to follow the stop clock for every call. A second test requires </w:t>
       </w:r>
-      <w:proofErr w:type="spellStart"/>
-      <w:proofErr w:type="spellEnd"/>
+      <w:r>
+        <w:lastRenderedPageBreak/>
+        <w:t>the previous returned object to be absent before the next call. The regression tests establish the revised timer boundary; they do not quantify how much of the earlier prediction error was caused by result disposal. The ordinary verifier returns counts and eligibility flags with an empty manifest list.</w:t>
+      </w:r>
     </w:p>
     <w:p>
       <w:r>
@@ -869,13 +822,9 @@
     <w:p>
       <w:pPr>
         <w:pStyle w:val="Heading2"/>
-        <w:keepNext/>
       </w:pPr>
       <w:r>
-        <w:lastRenderedPageBreak/>
         <w:br/>
-      </w:r>
-      <w:r>
         <w:t>3.3 Fresh collection and fixed evaluation protocol</w:t>
       </w:r>
     </w:p>
@@ -937,7 +886,6 @@
           </w:tcPr>
           <w:p>
             <w:pPr>
-              <w:keepNext w:val="0"/>
               <w:spacing w:after="20" w:line="240" w:lineRule="auto"/>
             </w:pPr>
             <w:r>
@@ -963,7 +911,6 @@
           </w:tcPr>
           <w:p>
             <w:pPr>
-              <w:keepNext w:val="0"/>
               <w:spacing w:after="20" w:line="240" w:lineRule="auto"/>
               <w:jc w:val="center"/>
             </w:pPr>
@@ -990,7 +937,6 @@
           </w:tcPr>
           <w:p>
             <w:pPr>
-              <w:keepNext w:val="0"/>
               <w:spacing w:after="20" w:line="240" w:lineRule="auto"/>
               <w:jc w:val="center"/>
             </w:pPr>
@@ -1017,7 +963,6 @@
           </w:tcPr>
           <w:p>
             <w:pPr>
-              <w:keepNext w:val="0"/>
               <w:spacing w:after="20" w:line="240" w:lineRule="auto"/>
               <w:jc w:val="center"/>
             </w:pPr>
@@ -1044,7 +989,6 @@
           </w:tcPr>
           <w:p>
             <w:pPr>
-              <w:keepNext w:val="0"/>
               <w:spacing w:after="20" w:line="240" w:lineRule="auto"/>
               <w:jc w:val="center"/>
             </w:pPr>
@@ -1077,7 +1021,6 @@
           </w:tcPr>
           <w:p>
             <w:pPr>
-              <w:keepNext w:val="0"/>
               <w:spacing w:after="20" w:line="240" w:lineRule="auto"/>
             </w:pPr>
             <w:r>
@@ -1102,7 +1045,6 @@
           </w:tcPr>
           <w:p>
             <w:pPr>
-              <w:keepNext w:val="0"/>
               <w:spacing w:after="20" w:line="240" w:lineRule="auto"/>
               <w:jc w:val="center"/>
             </w:pPr>
@@ -1128,7 +1070,6 @@
           </w:tcPr>
           <w:p>
             <w:pPr>
-              <w:keepNext w:val="0"/>
               <w:spacing w:after="20" w:line="240" w:lineRule="auto"/>
               <w:jc w:val="center"/>
             </w:pPr>
@@ -1154,7 +1095,6 @@
           </w:tcPr>
           <w:p>
             <w:pPr>
-              <w:keepNext w:val="0"/>
               <w:spacing w:after="20" w:line="240" w:lineRule="auto"/>
               <w:jc w:val="center"/>
             </w:pPr>
@@ -1180,7 +1120,6 @@
           </w:tcPr>
           <w:p>
             <w:pPr>
-              <w:keepNext w:val="0"/>
               <w:spacing w:after="20" w:line="240" w:lineRule="auto"/>
               <w:jc w:val="center"/>
             </w:pPr>
@@ -1212,7 +1151,6 @@
           </w:tcPr>
           <w:p>
             <w:pPr>
-              <w:keepNext w:val="0"/>
               <w:spacing w:after="20" w:line="240" w:lineRule="auto"/>
             </w:pPr>
             <w:r>
@@ -1237,7 +1175,6 @@
           </w:tcPr>
           <w:p>
             <w:pPr>
-              <w:keepNext w:val="0"/>
               <w:spacing w:after="20" w:line="240" w:lineRule="auto"/>
               <w:jc w:val="center"/>
             </w:pPr>
@@ -1263,7 +1200,6 @@
           </w:tcPr>
           <w:p>
             <w:pPr>
-              <w:keepNext w:val="0"/>
               <w:spacing w:after="20" w:line="240" w:lineRule="auto"/>
               <w:jc w:val="center"/>
             </w:pPr>
@@ -1289,7 +1225,6 @@
           </w:tcPr>
           <w:p>
             <w:pPr>
-              <w:keepNext w:val="0"/>
               <w:spacing w:after="20" w:line="240" w:lineRule="auto"/>
               <w:jc w:val="center"/>
             </w:pPr>
@@ -1315,7 +1250,6 @@
           </w:tcPr>
           <w:p>
             <w:pPr>
-              <w:keepNext w:val="0"/>
               <w:spacing w:after="20" w:line="240" w:lineRule="auto"/>
               <w:jc w:val="center"/>
             </w:pPr>
@@ -1341,7 +1275,6 @@
     </w:p>
     <w:p>
       <w:r>
-        <w:rPr/>
         <w:t>Version 4.2 recollected calibration, development and evaluation on an AMD EPYC 9V74 host after the Intel host became unavailable. The 31 completed Intel histories and 372 observed measurements were not recovered and were excluded from all version 4.2 analyses. Model forms, fitting objective, workload grid and acceptance rule were preserved. The experiment uses one measurement process at a time on a virtualized Linux host. All mutable files reside in a private temporary execution directory during collection and are saved after each completed history, while all measurement workers are stopped. The next history begins only after a successful durable save.</w:t>
       </w:r>
     </w:p>
@@ -1352,8 +1285,11 @@
     </w:p>
     <w:p>
       <w:r>
-        <w:rPr/>
-        <w:t>Before the fresh 100,000-record evaluation, the code, schedule, model definitions, fitted coefficients, acceptance rules and development-input hashes were frozen in a private hosted snapshot. The previous campaign and evaluation scale were known when this protocol was set. The snapshot documents this revision prospectively; it is not public preregistration or independent attestation of the host clock.</w:t>
+        <w:t xml:space="preserve">Before the fresh 100,000-record evaluation, the code, schedule, model definitions, fitted coefficients, acceptance rules and development-input hashes were frozen in a private hosted </w:t>
+      </w:r>
+      <w:r>
+        <w:lastRenderedPageBreak/>
+        <w:t>snapshot. The previous campaign and evaluation scale were known when this protocol was set. The snapshot documents this revision prospectively; it is not public preregistration or independent attestation of the host clock.</w:t>
       </w:r>
     </w:p>
     <w:p>
@@ -1369,10 +1305,8 @@
     <w:p>
       <w:pPr>
         <w:pStyle w:val="Heading2"/>
-        <w:keepNext/>
       </w:pPr>
       <w:r>
-        <w:lastRenderedPageBreak/>
         <w:t>3.4 Corrected model and fair comparators</w:t>
       </w:r>
     </w:p>
@@ -1384,7 +1318,7 @@
     <w:p>
       <w:pPr>
         <w:tabs>
-          <w:tab w:pos="7128" w:val="right"/>
+          <w:tab w:val="right" w:pos="7128"/>
         </w:tabs>
       </w:pPr>
       <m:oMath>
@@ -1603,15 +1537,12 @@
     <w:p>
       <w:pPr>
         <w:pStyle w:val="Heading3"/>
-        <w:keepNext/>
         <w:spacing w:after="100"/>
       </w:pPr>
       <w:r>
         <w:rPr>
           <w:rFonts w:ascii="Times New Roman" w:hAnsi="Times New Roman"/>
-          <w:b/>
           <w:color w:val="000000"/>
-          <w:sz w:val="20"/>
         </w:rPr>
         <w:t>3.4.1 Calibration overhead and deployment requirements</w:t>
       </w:r>
@@ -1621,11 +1552,11 @@
         <w:spacing w:after="100"/>
       </w:pPr>
       <w:r>
-        <w:rPr>
-          <w:rFonts w:ascii="Times New Roman" w:hAnsi="Times New Roman"/>
-          <w:sz w:val="20"/>
-        </w:rPr>
-        <w:t>Calibration requires representative complete-query measurements followed by a nonnegative coefficient fit. The seven-term model uses 432 balanced development observations aggregated into 36 cell medians and a 36 × 7 fitting matrix. Isolated-mode observations and the ten-block primitive microbenchmark calibration do not train this fit. Calibration-only collection time, solver time and solver peak memory were not separately reported; no measured calibration-runtime estimate is therefore claimed.</w:t>
+        <w:t xml:space="preserve">Calibration requires representative complete-query measurements followed by a nonnegative coefficient fit. The seven-term model uses 432 balanced development observations aggregated into 36 cell medians and a 36 × 7 fitting matrix. Isolated-mode observations and the ten-block primitive microbenchmark calibration do not train this fit. </w:t>
+      </w:r>
+      <w:r>
+        <w:lastRenderedPageBreak/>
+        <w:t>Calibration-only collection time, solver time and solver peak memory were not separately reported; no measured calibration-runtime estimate is therefore claimed.</w:t>
       </w:r>
     </w:p>
     <w:p>
@@ -1633,17 +1564,12 @@
         <w:spacing w:after="100"/>
       </w:pPr>
       <w:r>
-        <w:rPr>
-          <w:rFonts w:ascii="Times New Roman" w:hAnsi="Times New Roman"/>
-          <w:sz w:val="20"/>
-        </w:rPr>
         <w:t>Once workload counts are available, prediction requires six coefficient-count products plus the intercept and their sum. Obtaining the counts may itself require parsing or traversal. Deployment requires a declared timing boundary, independently checked workload counts, representative development histories, a monotonic timer, an NNLS solver and retained environment metadata. Calibration should occur outside request timing. Changes to hardware, library builds, evidence encoding or service behavior require local refitting and validation.</w:t>
       </w:r>
     </w:p>
     <w:p>
       <w:pPr>
         <w:pStyle w:val="Heading2"/>
-        <w:keepNext/>
       </w:pPr>
       <w:r>
         <w:t>3.5 Endpoints and uncertainty</w:t>
@@ -1662,7 +1588,6 @@
     <w:p>
       <w:pPr>
         <w:pStyle w:val="Heading1"/>
-        <w:keepNext/>
       </w:pPr>
       <w:r>
         <w:t>4 Results</w:t>
@@ -1671,7 +1596,6 @@
     <w:p>
       <w:pPr>
         <w:pStyle w:val="Heading2"/>
-        <w:keepNext/>
       </w:pPr>
       <w:r>
         <w:t>4.1 Collection and correctness</w:t>
@@ -1690,9 +1614,9 @@
     <w:p>
       <w:pPr>
         <w:pStyle w:val="Heading2"/>
-        <w:keepNext/>
       </w:pPr>
       <w:r>
+        <w:lastRenderedPageBreak/>
         <w:t>4.2 Storage accounting</w:t>
       </w:r>
     </w:p>
@@ -1753,7 +1677,6 @@
           </w:tcPr>
           <w:p>
             <w:pPr>
-              <w:keepNext w:val="0"/>
               <w:spacing w:after="20" w:line="240" w:lineRule="auto"/>
             </w:pPr>
             <w:r>
@@ -1779,7 +1702,6 @@
           </w:tcPr>
           <w:p>
             <w:pPr>
-              <w:keepNext w:val="0"/>
               <w:spacing w:after="20" w:line="240" w:lineRule="auto"/>
               <w:jc w:val="center"/>
             </w:pPr>
@@ -1806,7 +1728,6 @@
           </w:tcPr>
           <w:p>
             <w:pPr>
-              <w:keepNext w:val="0"/>
               <w:spacing w:after="20" w:line="240" w:lineRule="auto"/>
               <w:jc w:val="center"/>
             </w:pPr>
@@ -1833,7 +1754,6 @@
           </w:tcPr>
           <w:p>
             <w:pPr>
-              <w:keepNext w:val="0"/>
               <w:spacing w:after="20" w:line="240" w:lineRule="auto"/>
               <w:jc w:val="center"/>
             </w:pPr>
@@ -1866,7 +1786,6 @@
           </w:tcPr>
           <w:p>
             <w:pPr>
-              <w:keepNext w:val="0"/>
               <w:spacing w:after="20" w:line="240" w:lineRule="auto"/>
             </w:pPr>
             <w:r>
@@ -1891,7 +1810,6 @@
           </w:tcPr>
           <w:p>
             <w:pPr>
-              <w:keepNext w:val="0"/>
               <w:spacing w:after="20" w:line="240" w:lineRule="auto"/>
               <w:jc w:val="center"/>
             </w:pPr>
@@ -1917,7 +1835,6 @@
           </w:tcPr>
           <w:p>
             <w:pPr>
-              <w:keepNext w:val="0"/>
               <w:spacing w:after="20" w:line="240" w:lineRule="auto"/>
               <w:jc w:val="center"/>
             </w:pPr>
@@ -1943,7 +1860,6 @@
           </w:tcPr>
           <w:p>
             <w:pPr>
-              <w:keepNext w:val="0"/>
               <w:spacing w:after="20" w:line="240" w:lineRule="auto"/>
               <w:jc w:val="center"/>
             </w:pPr>
@@ -1964,14 +1880,12 @@
     </w:p>
     <w:p>
       <w:r>
-        <w:rPr/>
         <w:t>At 100,000 records and five renewals, E uses 94.02% less evidence storage than N and D uses 93.21% less. These are ledger consequences of batching in the fixed envelope. They exclude payload storage. For a selected record with 12 siblings, N and E proofs occupy 28,900 and 29,324 bytes respectively. These exact byte counts verify the storage ledger for the fixed envelope and selected proof; they do not evaluate the latency model.</w:t>
       </w:r>
     </w:p>
     <w:p>
       <w:pPr>
         <w:pStyle w:val="Heading2"/>
-        <w:keepNext/>
       </w:pPr>
       <w:r>
         <w:t>4.3 Frozen model coefficients</w:t>
@@ -1986,27 +1900,22 @@
       <w:r>
         <w:t>Table 4 Frozen coefficients and their units</w:t>
       </w:r>
-      <w:r>
-        <w:rPr>
-          <w:b w:val="0"/>
-        </w:rPr>
-      </w:r>
     </w:p>
     <w:tbl>
       <w:tblPr>
         <w:tblStyle w:val="TableGrid"/>
-        <w:tblW w:type="auto" w:w="0"/>
+        <w:tblW w:w="0" w:type="auto"/>
         <w:jc w:val="center"/>
+        <w:tblBorders>
+          <w:top w:val="single" w:sz="4" w:space="0" w:color="D9D9D9"/>
+          <w:left w:val="single" w:sz="4" w:space="0" w:color="D9D9D9"/>
+          <w:bottom w:val="single" w:sz="4" w:space="0" w:color="D9D9D9"/>
+          <w:right w:val="single" w:sz="4" w:space="0" w:color="D9D9D9"/>
+          <w:insideH w:val="single" w:sz="4" w:space="0" w:color="D9D9D9"/>
+          <w:insideV w:val="single" w:sz="4" w:space="0" w:color="D9D9D9"/>
+        </w:tblBorders>
         <w:tblLayout w:type="fixed"/>
-        <w:tblLook w:firstColumn="1" w:firstRow="1" w:lastColumn="0" w:lastRow="0" w:noHBand="0" w:noVBand="1" w:val="04A0"/>
-        <w:tblBorders>
-          <w:top w:val="single" w:sz="4" w:color="D9D9D9"/>
-          <w:left w:val="single" w:sz="4" w:color="D9D9D9"/>
-          <w:bottom w:val="single" w:sz="4" w:color="D9D9D9"/>
-          <w:right w:val="single" w:sz="4" w:color="D9D9D9"/>
-          <w:insideH w:val="single" w:sz="4" w:color="D9D9D9"/>
-          <w:insideV w:val="single" w:sz="4" w:color="D9D9D9"/>
-        </w:tblBorders>
+        <w:tblLook w:val="04A0" w:firstRow="1" w:lastRow="0" w:firstColumn="1" w:lastColumn="0" w:noHBand="0" w:noVBand="1"/>
       </w:tblPr>
       <w:tblGrid>
         <w:gridCol w:w="576"/>
@@ -2018,33 +1927,28 @@
         <w:trPr>
           <w:cantSplit/>
           <w:tblHeader/>
-          <w:cantSplit/>
-          <w:tblHeader/>
+          <w:jc w:val="center"/>
         </w:trPr>
         <w:tc>
           <w:tcPr>
-            <w:tcW w:type="dxa" w:w="576"/>
-            <w:shd w:fill="E8EDF1"/>
-            <w:vAlign w:val="center"/>
+            <w:tcW w:w="576" w:type="dxa"/>
+            <w:shd w:val="clear" w:color="auto" w:fill="E8EDF1"/>
             <w:tcMar>
               <w:top w:w="65" w:type="dxa"/>
               <w:left w:w="65" w:type="dxa"/>
               <w:bottom w:w="65" w:type="dxa"/>
               <w:right w:w="65" w:type="dxa"/>
             </w:tcMar>
-          </w:tcPr>
-          <w:p>
-            <w:pPr>
-              <w:keepNext w:val="0"/>
+            <w:vAlign w:val="center"/>
+          </w:tcPr>
+          <w:p>
+            <w:pPr>
               <w:keepLines/>
-              <w:spacing w:after="0" w:before="0" w:line="240" w:lineRule="auto"/>
-              <w:jc w:val="left"/>
-            </w:pPr>
-            <w:r>
-              <w:rPr>
-                <w:rFonts w:ascii="Times New Roman" w:hAnsi="Times New Roman"/>
+              <w:spacing w:after="0" w:line="240" w:lineRule="auto"/>
+            </w:pPr>
+            <w:r>
+              <w:rPr>
                 <w:b/>
-                <w:color w:val="000000"/>
                 <w:sz w:val="18"/>
               </w:rPr>
               <w:t>Term</w:t>
@@ -2053,28 +1957,24 @@
         </w:tc>
         <w:tc>
           <w:tcPr>
-            <w:tcW w:type="dxa" w:w="2693"/>
-            <w:shd w:fill="E8EDF1"/>
-            <w:vAlign w:val="center"/>
+            <w:tcW w:w="2693" w:type="dxa"/>
+            <w:shd w:val="clear" w:color="auto" w:fill="E8EDF1"/>
             <w:tcMar>
               <w:top w:w="65" w:type="dxa"/>
               <w:left w:w="65" w:type="dxa"/>
               <w:bottom w:w="65" w:type="dxa"/>
               <w:right w:w="65" w:type="dxa"/>
             </w:tcMar>
-          </w:tcPr>
-          <w:p>
-            <w:pPr>
-              <w:keepNext w:val="0"/>
+            <w:vAlign w:val="center"/>
+          </w:tcPr>
+          <w:p>
+            <w:pPr>
               <w:keepLines/>
-              <w:spacing w:after="0" w:before="0" w:line="240" w:lineRule="auto"/>
-              <w:jc w:val="left"/>
-            </w:pPr>
-            <w:r>
-              <w:rPr>
-                <w:rFonts w:ascii="Times New Roman" w:hAnsi="Times New Roman"/>
+              <w:spacing w:after="0" w:line="240" w:lineRule="auto"/>
+            </w:pPr>
+            <w:r>
+              <w:rPr>
                 <w:b/>
-                <w:color w:val="000000"/>
                 <w:sz w:val="18"/>
               </w:rPr>
               <w:t>Counted work</w:t>
@@ -2083,28 +1983,25 @@
         </w:tc>
         <w:tc>
           <w:tcPr>
-            <w:tcW w:type="dxa" w:w="2059"/>
-            <w:shd w:fill="E8EDF1"/>
-            <w:vAlign w:val="center"/>
+            <w:tcW w:w="2059" w:type="dxa"/>
+            <w:shd w:val="clear" w:color="auto" w:fill="E8EDF1"/>
             <w:tcMar>
               <w:top w:w="65" w:type="dxa"/>
               <w:left w:w="65" w:type="dxa"/>
               <w:bottom w:w="65" w:type="dxa"/>
               <w:right w:w="65" w:type="dxa"/>
             </w:tcMar>
-          </w:tcPr>
-          <w:p>
-            <w:pPr>
-              <w:keepNext w:val="0"/>
+            <w:vAlign w:val="center"/>
+          </w:tcPr>
+          <w:p>
+            <w:pPr>
               <w:keepLines/>
-              <w:spacing w:after="0" w:before="0" w:line="240" w:lineRule="auto"/>
-              <w:jc w:val="center"/>
-            </w:pPr>
-            <w:r>
-              <w:rPr>
-                <w:rFonts w:ascii="Times New Roman" w:hAnsi="Times New Roman"/>
+              <w:spacing w:after="0" w:line="240" w:lineRule="auto"/>
+              <w:jc w:val="center"/>
+            </w:pPr>
+            <w:r>
+              <w:rPr>
                 <w:b/>
-                <w:color w:val="000000"/>
                 <w:sz w:val="18"/>
               </w:rPr>
               <w:t>Seconds per unit</w:t>
@@ -2113,28 +2010,25 @@
         </w:tc>
         <w:tc>
           <w:tcPr>
-            <w:tcW w:type="dxa" w:w="2059"/>
-            <w:shd w:fill="E8EDF1"/>
-            <w:vAlign w:val="center"/>
+            <w:tcW w:w="2059" w:type="dxa"/>
+            <w:shd w:val="clear" w:color="auto" w:fill="E8EDF1"/>
             <w:tcMar>
               <w:top w:w="65" w:type="dxa"/>
               <w:left w:w="65" w:type="dxa"/>
               <w:bottom w:w="65" w:type="dxa"/>
               <w:right w:w="65" w:type="dxa"/>
             </w:tcMar>
-          </w:tcPr>
-          <w:p>
-            <w:pPr>
-              <w:keepNext w:val="0"/>
+            <w:vAlign w:val="center"/>
+          </w:tcPr>
+          <w:p>
+            <w:pPr>
               <w:keepLines/>
-              <w:spacing w:after="0" w:before="0" w:line="240" w:lineRule="auto"/>
-              <w:jc w:val="center"/>
-            </w:pPr>
-            <w:r>
-              <w:rPr>
-                <w:rFonts w:ascii="Times New Roman" w:hAnsi="Times New Roman"/>
+              <w:spacing w:after="0" w:line="240" w:lineRule="auto"/>
+              <w:jc w:val="center"/>
+            </w:pPr>
+            <w:r>
+              <w:rPr>
                 <w:b/>
-                <w:color w:val="000000"/>
                 <w:sz w:val="18"/>
               </w:rPr>
               <w:t>Microseconds per unit</w:t>
@@ -2145,32 +2039,27 @@
       <w:tr>
         <w:trPr>
           <w:cantSplit/>
-          <w:cantSplit/>
+          <w:jc w:val="center"/>
         </w:trPr>
         <w:tc>
           <w:tcPr>
-            <w:tcW w:type="dxa" w:w="576"/>
-            <w:vAlign w:val="center"/>
+            <w:tcW w:w="576" w:type="dxa"/>
+            <w:shd w:val="clear" w:color="auto" w:fill="FFFFFF"/>
             <w:tcMar>
               <w:top w:w="65" w:type="dxa"/>
               <w:left w:w="65" w:type="dxa"/>
               <w:bottom w:w="65" w:type="dxa"/>
               <w:right w:w="65" w:type="dxa"/>
             </w:tcMar>
-            <w:shd w:fill="FFFFFF"/>
-          </w:tcPr>
-          <w:p>
-            <w:pPr>
-              <w:keepNext w:val="0"/>
+            <w:vAlign w:val="center"/>
+          </w:tcPr>
+          <w:p>
+            <w:pPr>
               <w:keepLines/>
-              <w:spacing w:after="0" w:before="0" w:line="240" w:lineRule="auto"/>
-              <w:jc w:val="left"/>
-            </w:pPr>
-            <w:r>
-              <w:rPr>
-                <w:rFonts w:ascii="Times New Roman" w:hAnsi="Times New Roman"/>
-                <w:b w:val="0"/>
-                <w:color w:val="000000"/>
+              <w:spacing w:after="0" w:line="240" w:lineRule="auto"/>
+            </w:pPr>
+            <w:r>
+              <w:rPr>
                 <w:sz w:val="18"/>
               </w:rPr>
               <w:t>α</w:t>
@@ -2179,28 +2068,23 @@
         </w:tc>
         <w:tc>
           <w:tcPr>
-            <w:tcW w:type="dxa" w:w="2693"/>
-            <w:vAlign w:val="center"/>
+            <w:tcW w:w="2693" w:type="dxa"/>
+            <w:shd w:val="clear" w:color="auto" w:fill="FFFFFF"/>
             <w:tcMar>
               <w:top w:w="65" w:type="dxa"/>
               <w:left w:w="65" w:type="dxa"/>
               <w:bottom w:w="65" w:type="dxa"/>
               <w:right w:w="65" w:type="dxa"/>
             </w:tcMar>
-            <w:shd w:fill="FFFFFF"/>
-          </w:tcPr>
-          <w:p>
-            <w:pPr>
-              <w:keepNext w:val="0"/>
+            <w:vAlign w:val="center"/>
+          </w:tcPr>
+          <w:p>
+            <w:pPr>
               <w:keepLines/>
-              <w:spacing w:after="0" w:before="0" w:line="240" w:lineRule="auto"/>
-              <w:jc w:val="left"/>
-            </w:pPr>
-            <w:r>
-              <w:rPr>
-                <w:rFonts w:ascii="Times New Roman" w:hAnsi="Times New Roman"/>
-                <w:b w:val="0"/>
-                <w:color w:val="000000"/>
+              <w:spacing w:after="0" w:line="240" w:lineRule="auto"/>
+            </w:pPr>
+            <w:r>
+              <w:rPr>
                 <w:sz w:val="18"/>
               </w:rPr>
               <w:t>Fixed query overhead</w:t>
@@ -2209,28 +2093,24 @@
         </w:tc>
         <w:tc>
           <w:tcPr>
-            <w:tcW w:type="dxa" w:w="2059"/>
-            <w:vAlign w:val="center"/>
+            <w:tcW w:w="2059" w:type="dxa"/>
+            <w:shd w:val="clear" w:color="auto" w:fill="FFFFFF"/>
             <w:tcMar>
               <w:top w:w="65" w:type="dxa"/>
               <w:left w:w="65" w:type="dxa"/>
               <w:bottom w:w="65" w:type="dxa"/>
               <w:right w:w="65" w:type="dxa"/>
             </w:tcMar>
-            <w:shd w:fill="FFFFFF"/>
-          </w:tcPr>
-          <w:p>
-            <w:pPr>
-              <w:keepNext w:val="0"/>
+            <w:vAlign w:val="center"/>
+          </w:tcPr>
+          <w:p>
+            <w:pPr>
               <w:keepLines/>
-              <w:spacing w:after="0" w:before="0" w:line="240" w:lineRule="auto"/>
-              <w:jc w:val="center"/>
-            </w:pPr>
-            <w:r>
-              <w:rPr>
-                <w:rFonts w:ascii="Times New Roman" w:hAnsi="Times New Roman"/>
-                <w:b w:val="0"/>
-                <w:color w:val="000000"/>
+              <w:spacing w:after="0" w:line="240" w:lineRule="auto"/>
+              <w:jc w:val="center"/>
+            </w:pPr>
+            <w:r>
+              <w:rPr>
                 <w:sz w:val="18"/>
               </w:rPr>
               <w:t>0.000215746687</w:t>
@@ -2239,28 +2119,24 @@
         </w:tc>
         <w:tc>
           <w:tcPr>
-            <w:tcW w:type="dxa" w:w="2059"/>
-            <w:vAlign w:val="center"/>
+            <w:tcW w:w="2059" w:type="dxa"/>
+            <w:shd w:val="clear" w:color="auto" w:fill="FFFFFF"/>
             <w:tcMar>
               <w:top w:w="65" w:type="dxa"/>
               <w:left w:w="65" w:type="dxa"/>
               <w:bottom w:w="65" w:type="dxa"/>
               <w:right w:w="65" w:type="dxa"/>
             </w:tcMar>
-            <w:shd w:fill="FFFFFF"/>
-          </w:tcPr>
-          <w:p>
-            <w:pPr>
-              <w:keepNext w:val="0"/>
+            <w:vAlign w:val="center"/>
+          </w:tcPr>
+          <w:p>
+            <w:pPr>
               <w:keepLines/>
-              <w:spacing w:after="0" w:before="0" w:line="240" w:lineRule="auto"/>
-              <w:jc w:val="center"/>
-            </w:pPr>
-            <w:r>
-              <w:rPr>
-                <w:rFonts w:ascii="Times New Roman" w:hAnsi="Times New Roman"/>
-                <w:b w:val="0"/>
-                <w:color w:val="000000"/>
+              <w:spacing w:after="0" w:line="240" w:lineRule="auto"/>
+              <w:jc w:val="center"/>
+            </w:pPr>
+            <w:r>
+              <w:rPr>
                 <w:sz w:val="18"/>
               </w:rPr>
               <w:t>215.746687</w:t>
@@ -2271,32 +2147,27 @@
       <w:tr>
         <w:trPr>
           <w:cantSplit/>
-          <w:cantSplit/>
+          <w:jc w:val="center"/>
         </w:trPr>
         <w:tc>
           <w:tcPr>
-            <w:tcW w:type="dxa" w:w="576"/>
-            <w:vAlign w:val="center"/>
+            <w:tcW w:w="576" w:type="dxa"/>
+            <w:shd w:val="clear" w:color="auto" w:fill="FFFFFF"/>
             <w:tcMar>
               <w:top w:w="65" w:type="dxa"/>
               <w:left w:w="65" w:type="dxa"/>
               <w:bottom w:w="65" w:type="dxa"/>
               <w:right w:w="65" w:type="dxa"/>
             </w:tcMar>
-            <w:shd w:fill="FFFFFF"/>
-          </w:tcPr>
-          <w:p>
-            <w:pPr>
-              <w:keepNext w:val="0"/>
+            <w:vAlign w:val="center"/>
+          </w:tcPr>
+          <w:p>
+            <w:pPr>
               <w:keepLines/>
-              <w:spacing w:after="0" w:before="0" w:line="240" w:lineRule="auto"/>
-              <w:jc w:val="left"/>
-            </w:pPr>
-            <w:r>
-              <w:rPr>
-                <w:rFonts w:ascii="Times New Roman" w:hAnsi="Times New Roman"/>
-                <w:b w:val="0"/>
-                <w:color w:val="000000"/>
+              <w:spacing w:after="0" w:line="240" w:lineRule="auto"/>
+            </w:pPr>
+            <w:r>
+              <w:rPr>
                 <w:sz w:val="18"/>
               </w:rPr>
               <w:t>ρ</w:t>
@@ -2305,28 +2176,23 @@
         </w:tc>
         <w:tc>
           <w:tcPr>
-            <w:tcW w:type="dxa" w:w="2693"/>
-            <w:vAlign w:val="center"/>
+            <w:tcW w:w="2693" w:type="dxa"/>
+            <w:shd w:val="clear" w:color="auto" w:fill="FFFFFF"/>
             <w:tcMar>
               <w:top w:w="65" w:type="dxa"/>
               <w:left w:w="65" w:type="dxa"/>
               <w:bottom w:w="65" w:type="dxa"/>
               <w:right w:w="65" w:type="dxa"/>
             </w:tcMar>
-            <w:shd w:fill="FFFFFF"/>
-          </w:tcPr>
-          <w:p>
-            <w:pPr>
-              <w:keepNext w:val="0"/>
+            <w:vAlign w:val="center"/>
+          </w:tcPr>
+          <w:p>
+            <w:pPr>
               <w:keepLines/>
-              <w:spacing w:after="0" w:before="0" w:line="240" w:lineRule="auto"/>
-              <w:jc w:val="left"/>
-            </w:pPr>
-            <w:r>
-              <w:rPr>
-                <w:rFonts w:ascii="Times New Roman" w:hAnsi="Times New Roman"/>
-                <w:b w:val="0"/>
-                <w:color w:val="000000"/>
+              <w:spacing w:after="0" w:line="240" w:lineRule="auto"/>
+            </w:pPr>
+            <w:r>
+              <w:rPr>
                 <w:sz w:val="18"/>
               </w:rPr>
               <w:t>Validated manifests</w:t>
@@ -2335,28 +2201,24 @@
         </w:tc>
         <w:tc>
           <w:tcPr>
-            <w:tcW w:type="dxa" w:w="2059"/>
-            <w:vAlign w:val="center"/>
+            <w:tcW w:w="2059" w:type="dxa"/>
+            <w:shd w:val="clear" w:color="auto" w:fill="FFFFFF"/>
             <w:tcMar>
               <w:top w:w="65" w:type="dxa"/>
               <w:left w:w="65" w:type="dxa"/>
               <w:bottom w:w="65" w:type="dxa"/>
               <w:right w:w="65" w:type="dxa"/>
             </w:tcMar>
-            <w:shd w:fill="FFFFFF"/>
-          </w:tcPr>
-          <w:p>
-            <w:pPr>
-              <w:keepNext w:val="0"/>
+            <w:vAlign w:val="center"/>
+          </w:tcPr>
+          <w:p>
+            <w:pPr>
               <w:keepLines/>
-              <w:spacing w:after="0" w:before="0" w:line="240" w:lineRule="auto"/>
-              <w:jc w:val="center"/>
-            </w:pPr>
-            <w:r>
-              <w:rPr>
-                <w:rFonts w:ascii="Times New Roman" w:hAnsi="Times New Roman"/>
-                <w:b w:val="0"/>
-                <w:color w:val="000000"/>
+              <w:spacing w:after="0" w:line="240" w:lineRule="auto"/>
+              <w:jc w:val="center"/>
+            </w:pPr>
+            <w:r>
+              <w:rPr>
                 <w:sz w:val="18"/>
               </w:rPr>
               <w:t>1.51147842e-05</w:t>
@@ -2365,28 +2227,24 @@
         </w:tc>
         <w:tc>
           <w:tcPr>
-            <w:tcW w:type="dxa" w:w="2059"/>
-            <w:vAlign w:val="center"/>
+            <w:tcW w:w="2059" w:type="dxa"/>
+            <w:shd w:val="clear" w:color="auto" w:fill="FFFFFF"/>
             <w:tcMar>
               <w:top w:w="65" w:type="dxa"/>
               <w:left w:w="65" w:type="dxa"/>
               <w:bottom w:w="65" w:type="dxa"/>
               <w:right w:w="65" w:type="dxa"/>
             </w:tcMar>
-            <w:shd w:fill="FFFFFF"/>
-          </w:tcPr>
-          <w:p>
-            <w:pPr>
-              <w:keepNext w:val="0"/>
+            <w:vAlign w:val="center"/>
+          </w:tcPr>
+          <w:p>
+            <w:pPr>
               <w:keepLines/>
-              <w:spacing w:after="0" w:before="0" w:line="240" w:lineRule="auto"/>
-              <w:jc w:val="center"/>
-            </w:pPr>
-            <w:r>
-              <w:rPr>
-                <w:rFonts w:ascii="Times New Roman" w:hAnsi="Times New Roman"/>
-                <w:b w:val="0"/>
-                <w:color w:val="000000"/>
+              <w:spacing w:after="0" w:line="240" w:lineRule="auto"/>
+              <w:jc w:val="center"/>
+            </w:pPr>
+            <w:r>
+              <w:rPr>
                 <w:sz w:val="18"/>
               </w:rPr>
               <w:t>15.114784</w:t>
@@ -2397,26 +2255,24 @@
       <w:tr>
         <w:trPr>
           <w:cantSplit/>
-          <w:cantSplit/>
+          <w:jc w:val="center"/>
         </w:trPr>
         <w:tc>
           <w:tcPr>
-            <w:tcW w:type="dxa" w:w="576"/>
-            <w:vAlign w:val="center"/>
+            <w:tcW w:w="576" w:type="dxa"/>
+            <w:shd w:val="clear" w:color="auto" w:fill="FFFFFF"/>
             <w:tcMar>
               <w:top w:w="65" w:type="dxa"/>
               <w:left w:w="65" w:type="dxa"/>
               <w:bottom w:w="65" w:type="dxa"/>
               <w:right w:w="65" w:type="dxa"/>
             </w:tcMar>
-            <w:shd w:fill="FFFFFF"/>
-          </w:tcPr>
-          <w:p>
-            <w:pPr>
-              <w:keepNext w:val="0"/>
+            <w:vAlign w:val="center"/>
+          </w:tcPr>
+          <w:p>
+            <w:pPr>
               <w:keepLines/>
-              <w:spacing w:after="0" w:before="0" w:line="240" w:lineRule="auto"/>
-              <w:jc w:val="left"/>
+              <w:spacing w:after="0" w:line="240" w:lineRule="auto"/>
             </w:pPr>
             <w:r>
               <w:t>β</w:t>
@@ -2431,28 +2287,23 @@
         </w:tc>
         <w:tc>
           <w:tcPr>
-            <w:tcW w:type="dxa" w:w="2693"/>
-            <w:vAlign w:val="center"/>
+            <w:tcW w:w="2693" w:type="dxa"/>
+            <w:shd w:val="clear" w:color="auto" w:fill="FFFFFF"/>
             <w:tcMar>
               <w:top w:w="65" w:type="dxa"/>
               <w:left w:w="65" w:type="dxa"/>
               <w:bottom w:w="65" w:type="dxa"/>
               <w:right w:w="65" w:type="dxa"/>
             </w:tcMar>
-            <w:shd w:fill="FFFFFF"/>
-          </w:tcPr>
-          <w:p>
-            <w:pPr>
-              <w:keepNext w:val="0"/>
+            <w:vAlign w:val="center"/>
+          </w:tcPr>
+          <w:p>
+            <w:pPr>
               <w:keepLines/>
-              <w:spacing w:after="0" w:before="0" w:line="240" w:lineRule="auto"/>
-              <w:jc w:val="left"/>
-            </w:pPr>
-            <w:r>
-              <w:rPr>
-                <w:rFonts w:ascii="Times New Roman" w:hAnsi="Times New Roman"/>
-                <w:b w:val="0"/>
-                <w:color w:val="000000"/>
+              <w:spacing w:after="0" w:line="240" w:lineRule="auto"/>
+            </w:pPr>
+            <w:r>
+              <w:rPr>
                 <w:sz w:val="18"/>
               </w:rPr>
               <w:t>ECDSA token checks</w:t>
@@ -2461,28 +2312,24 @@
         </w:tc>
         <w:tc>
           <w:tcPr>
-            <w:tcW w:type="dxa" w:w="2059"/>
-            <w:vAlign w:val="center"/>
+            <w:tcW w:w="2059" w:type="dxa"/>
+            <w:shd w:val="clear" w:color="auto" w:fill="FFFFFF"/>
             <w:tcMar>
               <w:top w:w="65" w:type="dxa"/>
               <w:left w:w="65" w:type="dxa"/>
               <w:bottom w:w="65" w:type="dxa"/>
               <w:right w:w="65" w:type="dxa"/>
             </w:tcMar>
-            <w:shd w:fill="FFFFFF"/>
-          </w:tcPr>
-          <w:p>
-            <w:pPr>
-              <w:keepNext w:val="0"/>
+            <w:vAlign w:val="center"/>
+          </w:tcPr>
+          <w:p>
+            <w:pPr>
               <w:keepLines/>
-              <w:spacing w:after="0" w:before="0" w:line="240" w:lineRule="auto"/>
-              <w:jc w:val="center"/>
-            </w:pPr>
-            <w:r>
-              <w:rPr>
-                <w:rFonts w:ascii="Times New Roman" w:hAnsi="Times New Roman"/>
-                <w:b w:val="0"/>
-                <w:color w:val="000000"/>
+              <w:spacing w:after="0" w:line="240" w:lineRule="auto"/>
+              <w:jc w:val="center"/>
+            </w:pPr>
+            <w:r>
+              <w:rPr>
                 <w:sz w:val="18"/>
               </w:rPr>
               <w:t>9.54181705e-05</w:t>
@@ -2491,28 +2338,24 @@
         </w:tc>
         <w:tc>
           <w:tcPr>
-            <w:tcW w:type="dxa" w:w="2059"/>
-            <w:vAlign w:val="center"/>
+            <w:tcW w:w="2059" w:type="dxa"/>
+            <w:shd w:val="clear" w:color="auto" w:fill="FFFFFF"/>
             <w:tcMar>
               <w:top w:w="65" w:type="dxa"/>
               <w:left w:w="65" w:type="dxa"/>
               <w:bottom w:w="65" w:type="dxa"/>
               <w:right w:w="65" w:type="dxa"/>
             </w:tcMar>
-            <w:shd w:fill="FFFFFF"/>
-          </w:tcPr>
-          <w:p>
-            <w:pPr>
-              <w:keepNext w:val="0"/>
+            <w:vAlign w:val="center"/>
+          </w:tcPr>
+          <w:p>
+            <w:pPr>
               <w:keepLines/>
-              <w:spacing w:after="0" w:before="0" w:line="240" w:lineRule="auto"/>
-              <w:jc w:val="center"/>
-            </w:pPr>
-            <w:r>
-              <w:rPr>
-                <w:rFonts w:ascii="Times New Roman" w:hAnsi="Times New Roman"/>
-                <w:b w:val="0"/>
-                <w:color w:val="000000"/>
+              <w:spacing w:after="0" w:line="240" w:lineRule="auto"/>
+              <w:jc w:val="center"/>
+            </w:pPr>
+            <w:r>
+              <w:rPr>
                 <w:sz w:val="18"/>
               </w:rPr>
               <w:t>95.418170</w:t>
@@ -2523,26 +2366,24 @@
       <w:tr>
         <w:trPr>
           <w:cantSplit/>
-          <w:cantSplit/>
+          <w:jc w:val="center"/>
         </w:trPr>
         <w:tc>
           <w:tcPr>
-            <w:tcW w:type="dxa" w:w="576"/>
-            <w:vAlign w:val="center"/>
+            <w:tcW w:w="576" w:type="dxa"/>
+            <w:shd w:val="clear" w:color="auto" w:fill="FFFFFF"/>
             <w:tcMar>
               <w:top w:w="65" w:type="dxa"/>
               <w:left w:w="65" w:type="dxa"/>
               <w:bottom w:w="65" w:type="dxa"/>
               <w:right w:w="65" w:type="dxa"/>
             </w:tcMar>
-            <w:shd w:fill="FFFFFF"/>
-          </w:tcPr>
-          <w:p>
-            <w:pPr>
-              <w:keepNext w:val="0"/>
+            <w:vAlign w:val="center"/>
+          </w:tcPr>
+          <w:p>
+            <w:pPr>
               <w:keepLines/>
-              <w:spacing w:after="0" w:before="0" w:line="240" w:lineRule="auto"/>
-              <w:jc w:val="left"/>
+              <w:spacing w:after="0" w:line="240" w:lineRule="auto"/>
             </w:pPr>
             <w:r>
               <w:t>β</w:t>
@@ -2557,28 +2398,23 @@
         </w:tc>
         <w:tc>
           <w:tcPr>
-            <w:tcW w:type="dxa" w:w="2693"/>
-            <w:vAlign w:val="center"/>
+            <w:tcW w:w="2693" w:type="dxa"/>
+            <w:shd w:val="clear" w:color="auto" w:fill="FFFFFF"/>
             <w:tcMar>
               <w:top w:w="65" w:type="dxa"/>
               <w:left w:w="65" w:type="dxa"/>
               <w:bottom w:w="65" w:type="dxa"/>
               <w:right w:w="65" w:type="dxa"/>
             </w:tcMar>
-            <w:shd w:fill="FFFFFF"/>
-          </w:tcPr>
-          <w:p>
-            <w:pPr>
-              <w:keepNext w:val="0"/>
+            <w:vAlign w:val="center"/>
+          </w:tcPr>
+          <w:p>
+            <w:pPr>
               <w:keepLines/>
-              <w:spacing w:after="0" w:before="0" w:line="240" w:lineRule="auto"/>
-              <w:jc w:val="left"/>
-            </w:pPr>
-            <w:r>
-              <w:rPr>
-                <w:rFonts w:ascii="Times New Roman" w:hAnsi="Times New Roman"/>
-                <w:b w:val="0"/>
-                <w:color w:val="000000"/>
+              <w:spacing w:after="0" w:line="240" w:lineRule="auto"/>
+            </w:pPr>
+            <w:r>
+              <w:rPr>
                 <w:sz w:val="18"/>
               </w:rPr>
               <w:t>ML-DSA token checks</w:t>
@@ -2587,28 +2423,24 @@
         </w:tc>
         <w:tc>
           <w:tcPr>
-            <w:tcW w:type="dxa" w:w="2059"/>
-            <w:vAlign w:val="center"/>
+            <w:tcW w:w="2059" w:type="dxa"/>
+            <w:shd w:val="clear" w:color="auto" w:fill="FFFFFF"/>
             <w:tcMar>
               <w:top w:w="65" w:type="dxa"/>
               <w:left w:w="65" w:type="dxa"/>
               <w:bottom w:w="65" w:type="dxa"/>
               <w:right w:w="65" w:type="dxa"/>
             </w:tcMar>
-            <w:shd w:fill="FFFFFF"/>
-          </w:tcPr>
-          <w:p>
-            <w:pPr>
-              <w:keepNext w:val="0"/>
+            <w:vAlign w:val="center"/>
+          </w:tcPr>
+          <w:p>
+            <w:pPr>
               <w:keepLines/>
-              <w:spacing w:after="0" w:before="0" w:line="240" w:lineRule="auto"/>
-              <w:jc w:val="center"/>
-            </w:pPr>
-            <w:r>
-              <w:rPr>
-                <w:rFonts w:ascii="Times New Roman" w:hAnsi="Times New Roman"/>
-                <w:b w:val="0"/>
-                <w:color w:val="000000"/>
+              <w:spacing w:after="0" w:line="240" w:lineRule="auto"/>
+              <w:jc w:val="center"/>
+            </w:pPr>
+            <w:r>
+              <w:rPr>
                 <w:sz w:val="18"/>
               </w:rPr>
               <w:t>4.08771966e-05</w:t>
@@ -2617,28 +2449,24 @@
         </w:tc>
         <w:tc>
           <w:tcPr>
-            <w:tcW w:type="dxa" w:w="2059"/>
-            <w:vAlign w:val="center"/>
+            <w:tcW w:w="2059" w:type="dxa"/>
+            <w:shd w:val="clear" w:color="auto" w:fill="FFFFFF"/>
             <w:tcMar>
               <w:top w:w="65" w:type="dxa"/>
               <w:left w:w="65" w:type="dxa"/>
               <w:bottom w:w="65" w:type="dxa"/>
               <w:right w:w="65" w:type="dxa"/>
             </w:tcMar>
-            <w:shd w:fill="FFFFFF"/>
-          </w:tcPr>
-          <w:p>
-            <w:pPr>
-              <w:keepNext w:val="0"/>
+            <w:vAlign w:val="center"/>
+          </w:tcPr>
+          <w:p>
+            <w:pPr>
               <w:keepLines/>
-              <w:spacing w:after="0" w:before="0" w:line="240" w:lineRule="auto"/>
-              <w:jc w:val="center"/>
-            </w:pPr>
-            <w:r>
-              <w:rPr>
-                <w:rFonts w:ascii="Times New Roman" w:hAnsi="Times New Roman"/>
-                <w:b w:val="0"/>
-                <w:color w:val="000000"/>
+              <w:spacing w:after="0" w:line="240" w:lineRule="auto"/>
+              <w:jc w:val="center"/>
+            </w:pPr>
+            <w:r>
+              <w:rPr>
                 <w:sz w:val="18"/>
               </w:rPr>
               <w:t>40.877197</w:t>
@@ -2649,26 +2477,24 @@
       <w:tr>
         <w:trPr>
           <w:cantSplit/>
-          <w:cantSplit/>
+          <w:jc w:val="center"/>
         </w:trPr>
         <w:tc>
           <w:tcPr>
-            <w:tcW w:type="dxa" w:w="576"/>
-            <w:vAlign w:val="center"/>
+            <w:tcW w:w="576" w:type="dxa"/>
+            <w:shd w:val="clear" w:color="auto" w:fill="FFFFFF"/>
             <w:tcMar>
               <w:top w:w="65" w:type="dxa"/>
               <w:left w:w="65" w:type="dxa"/>
               <w:bottom w:w="65" w:type="dxa"/>
               <w:right w:w="65" w:type="dxa"/>
             </w:tcMar>
-            <w:shd w:fill="FFFFFF"/>
-          </w:tcPr>
-          <w:p>
-            <w:pPr>
-              <w:keepNext w:val="0"/>
+            <w:vAlign w:val="center"/>
+          </w:tcPr>
+          <w:p>
+            <w:pPr>
               <w:keepLines/>
-              <w:spacing w:after="0" w:before="0" w:line="240" w:lineRule="auto"/>
-              <w:jc w:val="left"/>
+              <w:spacing w:after="0" w:line="240" w:lineRule="auto"/>
             </w:pPr>
             <w:r>
               <w:t>β</w:t>
@@ -2683,28 +2509,23 @@
         </w:tc>
         <w:tc>
           <w:tcPr>
-            <w:tcW w:type="dxa" w:w="2693"/>
-            <w:vAlign w:val="center"/>
+            <w:tcW w:w="2693" w:type="dxa"/>
+            <w:shd w:val="clear" w:color="auto" w:fill="FFFFFF"/>
             <w:tcMar>
               <w:top w:w="65" w:type="dxa"/>
               <w:left w:w="65" w:type="dxa"/>
               <w:bottom w:w="65" w:type="dxa"/>
               <w:right w:w="65" w:type="dxa"/>
             </w:tcMar>
-            <w:shd w:fill="FFFFFF"/>
-          </w:tcPr>
-          <w:p>
-            <w:pPr>
-              <w:keepNext w:val="0"/>
+            <w:vAlign w:val="center"/>
+          </w:tcPr>
+          <w:p>
+            <w:pPr>
               <w:keepLines/>
-              <w:spacing w:after="0" w:before="0" w:line="240" w:lineRule="auto"/>
-              <w:jc w:val="left"/>
-            </w:pPr>
-            <w:r>
-              <w:rPr>
-                <w:rFonts w:ascii="Times New Roman" w:hAnsi="Times New Roman"/>
-                <w:b w:val="0"/>
-                <w:color w:val="000000"/>
+              <w:spacing w:after="0" w:line="240" w:lineRule="auto"/>
+            </w:pPr>
+            <w:r>
+              <w:rPr>
                 <w:sz w:val="18"/>
               </w:rPr>
               <w:t>SLH-DSA token checks</w:t>
@@ -2713,28 +2534,24 @@
         </w:tc>
         <w:tc>
           <w:tcPr>
-            <w:tcW w:type="dxa" w:w="2059"/>
-            <w:vAlign w:val="center"/>
+            <w:tcW w:w="2059" w:type="dxa"/>
+            <w:shd w:val="clear" w:color="auto" w:fill="FFFFFF"/>
             <w:tcMar>
               <w:top w:w="65" w:type="dxa"/>
               <w:left w:w="65" w:type="dxa"/>
               <w:bottom w:w="65" w:type="dxa"/>
               <w:right w:w="65" w:type="dxa"/>
             </w:tcMar>
-            <w:shd w:fill="FFFFFF"/>
-          </w:tcPr>
-          <w:p>
-            <w:pPr>
-              <w:keepNext w:val="0"/>
+            <w:vAlign w:val="center"/>
+          </w:tcPr>
+          <w:p>
+            <w:pPr>
               <w:keepLines/>
-              <w:spacing w:after="0" w:before="0" w:line="240" w:lineRule="auto"/>
-              <w:jc w:val="center"/>
-            </w:pPr>
-            <w:r>
-              <w:rPr>
-                <w:rFonts w:ascii="Times New Roman" w:hAnsi="Times New Roman"/>
-                <w:b w:val="0"/>
-                <w:color w:val="000000"/>
+              <w:spacing w:after="0" w:line="240" w:lineRule="auto"/>
+              <w:jc w:val="center"/>
+            </w:pPr>
+            <w:r>
+              <w:rPr>
                 <w:sz w:val="18"/>
               </w:rPr>
               <w:t>0.00208522619</w:t>
@@ -2743,28 +2560,24 @@
         </w:tc>
         <w:tc>
           <w:tcPr>
-            <w:tcW w:type="dxa" w:w="2059"/>
-            <w:vAlign w:val="center"/>
+            <w:tcW w:w="2059" w:type="dxa"/>
+            <w:shd w:val="clear" w:color="auto" w:fill="FFFFFF"/>
             <w:tcMar>
               <w:top w:w="65" w:type="dxa"/>
               <w:left w:w="65" w:type="dxa"/>
               <w:bottom w:w="65" w:type="dxa"/>
               <w:right w:w="65" w:type="dxa"/>
             </w:tcMar>
-            <w:shd w:fill="FFFFFF"/>
-          </w:tcPr>
-          <w:p>
-            <w:pPr>
-              <w:keepNext w:val="0"/>
+            <w:vAlign w:val="center"/>
+          </w:tcPr>
+          <w:p>
+            <w:pPr>
               <w:keepLines/>
-              <w:spacing w:after="0" w:before="0" w:line="240" w:lineRule="auto"/>
-              <w:jc w:val="center"/>
-            </w:pPr>
-            <w:r>
-              <w:rPr>
-                <w:rFonts w:ascii="Times New Roman" w:hAnsi="Times New Roman"/>
-                <w:b w:val="0"/>
-                <w:color w:val="000000"/>
+              <w:spacing w:after="0" w:line="240" w:lineRule="auto"/>
+              <w:jc w:val="center"/>
+            </w:pPr>
+            <w:r>
+              <w:rPr>
                 <w:sz w:val="18"/>
               </w:rPr>
               <w:t>2085.22619</w:t>
@@ -2775,32 +2588,27 @@
       <w:tr>
         <w:trPr>
           <w:cantSplit/>
-          <w:cantSplit/>
+          <w:jc w:val="center"/>
         </w:trPr>
         <w:tc>
           <w:tcPr>
-            <w:tcW w:type="dxa" w:w="576"/>
-            <w:vAlign w:val="center"/>
+            <w:tcW w:w="576" w:type="dxa"/>
+            <w:shd w:val="clear" w:color="auto" w:fill="FFFFFF"/>
             <w:tcMar>
               <w:top w:w="65" w:type="dxa"/>
               <w:left w:w="65" w:type="dxa"/>
               <w:bottom w:w="65" w:type="dxa"/>
               <w:right w:w="65" w:type="dxa"/>
             </w:tcMar>
-            <w:shd w:fill="FFFFFF"/>
-          </w:tcPr>
-          <w:p>
-            <w:pPr>
-              <w:keepNext w:val="0"/>
+            <w:vAlign w:val="center"/>
+          </w:tcPr>
+          <w:p>
+            <w:pPr>
               <w:keepLines/>
-              <w:spacing w:after="0" w:before="0" w:line="240" w:lineRule="auto"/>
-              <w:jc w:val="left"/>
-            </w:pPr>
-            <w:r>
-              <w:rPr>
-                <w:rFonts w:ascii="Times New Roman" w:hAnsi="Times New Roman"/>
-                <w:b w:val="0"/>
-                <w:color w:val="000000"/>
+              <w:spacing w:after="0" w:line="240" w:lineRule="auto"/>
+            </w:pPr>
+            <w:r>
+              <w:rPr>
                 <w:sz w:val="18"/>
               </w:rPr>
               <w:t>κ</w:t>
@@ -2809,28 +2617,23 @@
         </w:tc>
         <w:tc>
           <w:tcPr>
-            <w:tcW w:type="dxa" w:w="2693"/>
-            <w:vAlign w:val="center"/>
+            <w:tcW w:w="2693" w:type="dxa"/>
+            <w:shd w:val="clear" w:color="auto" w:fill="FFFFFF"/>
             <w:tcMar>
               <w:top w:w="65" w:type="dxa"/>
               <w:left w:w="65" w:type="dxa"/>
               <w:bottom w:w="65" w:type="dxa"/>
               <w:right w:w="65" w:type="dxa"/>
             </w:tcMar>
-            <w:shd w:fill="FFFFFF"/>
-          </w:tcPr>
-          <w:p>
-            <w:pPr>
-              <w:keepNext w:val="0"/>
+            <w:vAlign w:val="center"/>
+          </w:tcPr>
+          <w:p>
+            <w:pPr>
               <w:keepLines/>
-              <w:spacing w:after="0" w:before="0" w:line="240" w:lineRule="auto"/>
-              <w:jc w:val="left"/>
-            </w:pPr>
-            <w:r>
-              <w:rPr>
-                <w:rFonts w:ascii="Times New Roman" w:hAnsi="Times New Roman"/>
-                <w:b w:val="0"/>
-                <w:color w:val="000000"/>
+              <w:spacing w:after="0" w:line="240" w:lineRule="auto"/>
+            </w:pPr>
+            <w:r>
+              <w:rPr>
                 <w:sz w:val="18"/>
               </w:rPr>
               <w:t>Enrollment objects</w:t>
@@ -2839,28 +2642,24 @@
         </w:tc>
         <w:tc>
           <w:tcPr>
-            <w:tcW w:type="dxa" w:w="2059"/>
-            <w:vAlign w:val="center"/>
+            <w:tcW w:w="2059" w:type="dxa"/>
+            <w:shd w:val="clear" w:color="auto" w:fill="FFFFFF"/>
             <w:tcMar>
               <w:top w:w="65" w:type="dxa"/>
               <w:left w:w="65" w:type="dxa"/>
               <w:bottom w:w="65" w:type="dxa"/>
               <w:right w:w="65" w:type="dxa"/>
             </w:tcMar>
-            <w:shd w:fill="FFFFFF"/>
-          </w:tcPr>
-          <w:p>
-            <w:pPr>
-              <w:keepNext w:val="0"/>
+            <w:vAlign w:val="center"/>
+          </w:tcPr>
+          <w:p>
+            <w:pPr>
               <w:keepLines/>
-              <w:spacing w:after="0" w:before="0" w:line="240" w:lineRule="auto"/>
-              <w:jc w:val="center"/>
-            </w:pPr>
-            <w:r>
-              <w:rPr>
-                <w:rFonts w:ascii="Times New Roman" w:hAnsi="Times New Roman"/>
-                <w:b w:val="0"/>
-                <w:color w:val="000000"/>
+              <w:spacing w:after="0" w:line="240" w:lineRule="auto"/>
+              <w:jc w:val="center"/>
+            </w:pPr>
+            <w:r>
+              <w:rPr>
                 <w:sz w:val="18"/>
               </w:rPr>
               <w:t>3.59735122e-05</w:t>
@@ -2869,28 +2668,24 @@
         </w:tc>
         <w:tc>
           <w:tcPr>
-            <w:tcW w:type="dxa" w:w="2059"/>
-            <w:vAlign w:val="center"/>
+            <w:tcW w:w="2059" w:type="dxa"/>
+            <w:shd w:val="clear" w:color="auto" w:fill="FFFFFF"/>
             <w:tcMar>
               <w:top w:w="65" w:type="dxa"/>
               <w:left w:w="65" w:type="dxa"/>
               <w:bottom w:w="65" w:type="dxa"/>
               <w:right w:w="65" w:type="dxa"/>
             </w:tcMar>
-            <w:shd w:fill="FFFFFF"/>
-          </w:tcPr>
-          <w:p>
-            <w:pPr>
-              <w:keepNext w:val="0"/>
+            <w:vAlign w:val="center"/>
+          </w:tcPr>
+          <w:p>
+            <w:pPr>
               <w:keepLines/>
-              <w:spacing w:after="0" w:before="0" w:line="240" w:lineRule="auto"/>
-              <w:jc w:val="center"/>
-            </w:pPr>
-            <w:r>
-              <w:rPr>
-                <w:rFonts w:ascii="Times New Roman" w:hAnsi="Times New Roman"/>
-                <w:b w:val="0"/>
-                <w:color w:val="000000"/>
+              <w:spacing w:after="0" w:line="240" w:lineRule="auto"/>
+              <w:jc w:val="center"/>
+            </w:pPr>
+            <w:r>
+              <w:rPr>
                 <w:sz w:val="18"/>
               </w:rPr>
               <w:t>35.973512</w:t>
@@ -2901,32 +2696,27 @@
       <w:tr>
         <w:trPr>
           <w:cantSplit/>
-          <w:cantSplit/>
+          <w:jc w:val="center"/>
         </w:trPr>
         <w:tc>
           <w:tcPr>
-            <w:tcW w:type="dxa" w:w="576"/>
-            <w:vAlign w:val="center"/>
+            <w:tcW w:w="576" w:type="dxa"/>
+            <w:shd w:val="clear" w:color="auto" w:fill="FFFFFF"/>
             <w:tcMar>
               <w:top w:w="65" w:type="dxa"/>
               <w:left w:w="65" w:type="dxa"/>
               <w:bottom w:w="65" w:type="dxa"/>
               <w:right w:w="65" w:type="dxa"/>
             </w:tcMar>
-            <w:shd w:fill="FFFFFF"/>
-          </w:tcPr>
-          <w:p>
-            <w:pPr>
-              <w:keepNext w:val="0"/>
+            <w:vAlign w:val="center"/>
+          </w:tcPr>
+          <w:p>
+            <w:pPr>
               <w:keepLines/>
-              <w:spacing w:after="0" w:before="0" w:line="240" w:lineRule="auto"/>
-              <w:jc w:val="left"/>
-            </w:pPr>
-            <w:r>
-              <w:rPr>
-                <w:rFonts w:ascii="Times New Roman" w:hAnsi="Times New Roman"/>
-                <w:b w:val="0"/>
-                <w:color w:val="000000"/>
+              <w:spacing w:after="0" w:line="240" w:lineRule="auto"/>
+            </w:pPr>
+            <w:r>
+              <w:rPr>
                 <w:sz w:val="18"/>
               </w:rPr>
               <w:t>η</w:t>
@@ -2935,28 +2725,23 @@
         </w:tc>
         <w:tc>
           <w:tcPr>
-            <w:tcW w:type="dxa" w:w="2693"/>
-            <w:vAlign w:val="center"/>
+            <w:tcW w:w="2693" w:type="dxa"/>
+            <w:shd w:val="clear" w:color="auto" w:fill="FFFFFF"/>
             <w:tcMar>
               <w:top w:w="65" w:type="dxa"/>
               <w:left w:w="65" w:type="dxa"/>
               <w:bottom w:w="65" w:type="dxa"/>
               <w:right w:w="65" w:type="dxa"/>
             </w:tcMar>
-            <w:shd w:fill="FFFFFF"/>
-          </w:tcPr>
-          <w:p>
-            <w:pPr>
-              <w:keepNext w:val="0"/>
+            <w:vAlign w:val="center"/>
+          </w:tcPr>
+          <w:p>
+            <w:pPr>
               <w:keepLines/>
-              <w:spacing w:after="0" w:before="0" w:line="240" w:lineRule="auto"/>
-              <w:jc w:val="left"/>
-            </w:pPr>
-            <w:r>
-              <w:rPr>
-                <w:rFonts w:ascii="Times New Roman" w:hAnsi="Times New Roman"/>
-                <w:b w:val="0"/>
-                <w:color w:val="000000"/>
+              <w:spacing w:after="0" w:line="240" w:lineRule="auto"/>
+            </w:pPr>
+            <w:r>
+              <w:rPr>
                 <w:sz w:val="18"/>
               </w:rPr>
               <w:t>Internal Merkle hashes</w:t>
@@ -2965,28 +2750,24 @@
         </w:tc>
         <w:tc>
           <w:tcPr>
-            <w:tcW w:type="dxa" w:w="2059"/>
-            <w:vAlign w:val="center"/>
+            <w:tcW w:w="2059" w:type="dxa"/>
+            <w:shd w:val="clear" w:color="auto" w:fill="FFFFFF"/>
             <w:tcMar>
               <w:top w:w="65" w:type="dxa"/>
               <w:left w:w="65" w:type="dxa"/>
               <w:bottom w:w="65" w:type="dxa"/>
               <w:right w:w="65" w:type="dxa"/>
             </w:tcMar>
-            <w:shd w:fill="FFFFFF"/>
-          </w:tcPr>
-          <w:p>
-            <w:pPr>
-              <w:keepNext w:val="0"/>
+            <w:vAlign w:val="center"/>
+          </w:tcPr>
+          <w:p>
+            <w:pPr>
               <w:keepLines/>
-              <w:spacing w:after="0" w:before="0" w:line="240" w:lineRule="auto"/>
-              <w:jc w:val="center"/>
-            </w:pPr>
-            <w:r>
-              <w:rPr>
-                <w:rFonts w:ascii="Times New Roman" w:hAnsi="Times New Roman"/>
-                <w:b w:val="0"/>
-                <w:color w:val="000000"/>
+              <w:spacing w:after="0" w:line="240" w:lineRule="auto"/>
+              <w:jc w:val="center"/>
+            </w:pPr>
+            <w:r>
+              <w:rPr>
                 <w:sz w:val="18"/>
               </w:rPr>
               <w:t>3.41325475e-06</w:t>
@@ -2995,28 +2776,24 @@
         </w:tc>
         <w:tc>
           <w:tcPr>
-            <w:tcW w:type="dxa" w:w="2059"/>
-            <w:vAlign w:val="center"/>
+            <w:tcW w:w="2059" w:type="dxa"/>
+            <w:shd w:val="clear" w:color="auto" w:fill="FFFFFF"/>
             <w:tcMar>
               <w:top w:w="65" w:type="dxa"/>
               <w:left w:w="65" w:type="dxa"/>
               <w:bottom w:w="65" w:type="dxa"/>
               <w:right w:w="65" w:type="dxa"/>
             </w:tcMar>
-            <w:shd w:fill="FFFFFF"/>
-          </w:tcPr>
-          <w:p>
-            <w:pPr>
-              <w:keepNext w:val="0"/>
+            <w:vAlign w:val="center"/>
+          </w:tcPr>
+          <w:p>
+            <w:pPr>
               <w:keepLines/>
-              <w:spacing w:after="0" w:before="0" w:line="240" w:lineRule="auto"/>
-              <w:jc w:val="center"/>
-            </w:pPr>
-            <w:r>
-              <w:rPr>
-                <w:rFonts w:ascii="Times New Roman" w:hAnsi="Times New Roman"/>
-                <w:b w:val="0"/>
-                <w:color w:val="000000"/>
+              <w:spacing w:after="0" w:line="240" w:lineRule="auto"/>
+              <w:jc w:val="center"/>
+            </w:pPr>
+            <w:r>
+              <w:rPr>
                 <w:sz w:val="18"/>
               </w:rPr>
               <w:t>3.413255</w:t>
@@ -3035,10 +2812,6 @@
         <w:spacing w:after="100"/>
       </w:pPr>
       <w:r>
-        <w:rPr>
-          <w:rFonts w:ascii="Times New Roman" w:hAnsi="Times New Roman"/>
-          <w:sz w:val="20"/>
-        </w:rPr>
         <w:t>For α, the value is per query; the other rows are per counted manifest, token, enrollment object or internal hash. Both unit columns are rounded representations of the same frozen coefficients. The coefficients are empirical allocations from jointly fitted complete queries rather than independently measured operation costs. Displayed digits support replay and do not imply equivalent measurement precision.</w:t>
       </w:r>
     </w:p>
@@ -3052,19 +2825,15 @@
         <w:spacing w:after="100"/>
       </w:pPr>
       <w:r>
-        <w:rPr>
-          <w:rFonts w:ascii="Times New Roman" w:hAnsi="Times New Roman"/>
-          <w:sz w:val="20"/>
-        </w:rPr>
         <w:t>For example, an E full query at n = 100,000 and R = 5 has k = 25 batches and G = 6 generations. Its counts are m = 100,000, vE = 25, vM = 125, vS = 0, e = 6 and h = n − k = 99,975. The current trees are reconstructed once, so h is not multiplied by G. Applying the printed coefficients gives 1860.645 ms, matching Table 6. These counts must be rechecked when adapting the model to another verifier.</w:t>
       </w:r>
     </w:p>
     <w:p>
       <w:pPr>
         <w:pStyle w:val="Heading2"/>
-        <w:keepNext/>
       </w:pPr>
       <w:r>
+        <w:lastRenderedPageBreak/>
         <w:t>4.4 Prediction performance</w:t>
       </w:r>
     </w:p>
@@ -3126,7 +2895,6 @@
           </w:tcPr>
           <w:p>
             <w:pPr>
-              <w:keepNext w:val="0"/>
               <w:spacing w:after="20" w:line="240" w:lineRule="auto"/>
             </w:pPr>
             <w:r>
@@ -3152,7 +2920,6 @@
           </w:tcPr>
           <w:p>
             <w:pPr>
-              <w:keepNext w:val="0"/>
               <w:spacing w:after="20" w:line="240" w:lineRule="auto"/>
               <w:jc w:val="center"/>
             </w:pPr>
@@ -3179,7 +2946,6 @@
           </w:tcPr>
           <w:p>
             <w:pPr>
-              <w:keepNext w:val="0"/>
               <w:spacing w:after="20" w:line="240" w:lineRule="auto"/>
               <w:jc w:val="center"/>
             </w:pPr>
@@ -3206,7 +2972,6 @@
           </w:tcPr>
           <w:p>
             <w:pPr>
-              <w:keepNext w:val="0"/>
               <w:spacing w:after="20" w:line="240" w:lineRule="auto"/>
               <w:jc w:val="center"/>
             </w:pPr>
@@ -3233,7 +2998,6 @@
           </w:tcPr>
           <w:p>
             <w:pPr>
-              <w:keepNext w:val="0"/>
               <w:spacing w:after="20" w:line="240" w:lineRule="auto"/>
               <w:jc w:val="center"/>
             </w:pPr>
@@ -3266,7 +3030,6 @@
           </w:tcPr>
           <w:p>
             <w:pPr>
-              <w:keepNext w:val="0"/>
               <w:spacing w:after="20" w:line="240" w:lineRule="auto"/>
             </w:pPr>
             <w:r>
@@ -3291,7 +3054,6 @@
           </w:tcPr>
           <w:p>
             <w:pPr>
-              <w:keepNext w:val="0"/>
               <w:spacing w:after="20" w:line="240" w:lineRule="auto"/>
               <w:jc w:val="center"/>
             </w:pPr>
@@ -3317,7 +3079,6 @@
           </w:tcPr>
           <w:p>
             <w:pPr>
-              <w:keepNext w:val="0"/>
               <w:spacing w:after="20" w:line="240" w:lineRule="auto"/>
               <w:jc w:val="center"/>
             </w:pPr>
@@ -3343,7 +3104,6 @@
           </w:tcPr>
           <w:p>
             <w:pPr>
-              <w:keepNext w:val="0"/>
               <w:spacing w:after="20" w:line="240" w:lineRule="auto"/>
               <w:jc w:val="center"/>
             </w:pPr>
@@ -3369,7 +3129,6 @@
           </w:tcPr>
           <w:p>
             <w:pPr>
-              <w:keepNext w:val="0"/>
               <w:spacing w:after="20" w:line="240" w:lineRule="auto"/>
               <w:jc w:val="center"/>
             </w:pPr>
@@ -3401,7 +3160,6 @@
           </w:tcPr>
           <w:p>
             <w:pPr>
-              <w:keepNext w:val="0"/>
               <w:spacing w:after="20" w:line="240" w:lineRule="auto"/>
             </w:pPr>
             <w:r>
@@ -3426,7 +3184,6 @@
           </w:tcPr>
           <w:p>
             <w:pPr>
-              <w:keepNext w:val="0"/>
               <w:spacing w:after="20" w:line="240" w:lineRule="auto"/>
               <w:jc w:val="center"/>
             </w:pPr>
@@ -3452,7 +3209,6 @@
           </w:tcPr>
           <w:p>
             <w:pPr>
-              <w:keepNext w:val="0"/>
               <w:spacing w:after="20" w:line="240" w:lineRule="auto"/>
               <w:jc w:val="center"/>
             </w:pPr>
@@ -3478,7 +3234,6 @@
           </w:tcPr>
           <w:p>
             <w:pPr>
-              <w:keepNext w:val="0"/>
               <w:spacing w:after="20" w:line="240" w:lineRule="auto"/>
               <w:jc w:val="center"/>
             </w:pPr>
@@ -3504,7 +3259,6 @@
           </w:tcPr>
           <w:p>
             <w:pPr>
-              <w:keepNext w:val="0"/>
               <w:spacing w:after="20" w:line="240" w:lineRule="auto"/>
               <w:jc w:val="center"/>
             </w:pPr>
@@ -3536,7 +3290,6 @@
           </w:tcPr>
           <w:p>
             <w:pPr>
-              <w:keepNext w:val="0"/>
               <w:spacing w:after="20" w:line="240" w:lineRule="auto"/>
             </w:pPr>
             <w:r>
@@ -3561,7 +3314,6 @@
           </w:tcPr>
           <w:p>
             <w:pPr>
-              <w:keepNext w:val="0"/>
               <w:spacing w:after="20" w:line="240" w:lineRule="auto"/>
               <w:jc w:val="center"/>
             </w:pPr>
@@ -3587,7 +3339,6 @@
           </w:tcPr>
           <w:p>
             <w:pPr>
-              <w:keepNext w:val="0"/>
               <w:spacing w:after="20" w:line="240" w:lineRule="auto"/>
               <w:jc w:val="center"/>
             </w:pPr>
@@ -3613,7 +3364,6 @@
           </w:tcPr>
           <w:p>
             <w:pPr>
-              <w:keepNext w:val="0"/>
               <w:spacing w:after="20" w:line="240" w:lineRule="auto"/>
               <w:jc w:val="center"/>
             </w:pPr>
@@ -3639,7 +3389,6 @@
           </w:tcPr>
           <w:p>
             <w:pPr>
-              <w:keepNext w:val="0"/>
               <w:spacing w:after="20" w:line="240" w:lineRule="auto"/>
               <w:jc w:val="center"/>
             </w:pPr>
@@ -3671,7 +3420,6 @@
           </w:tcPr>
           <w:p>
             <w:pPr>
-              <w:keepNext w:val="0"/>
               <w:spacing w:after="20" w:line="240" w:lineRule="auto"/>
             </w:pPr>
             <w:r>
@@ -3696,7 +3444,6 @@
           </w:tcPr>
           <w:p>
             <w:pPr>
-              <w:keepNext w:val="0"/>
               <w:spacing w:after="20" w:line="240" w:lineRule="auto"/>
               <w:jc w:val="center"/>
             </w:pPr>
@@ -3722,7 +3469,6 @@
           </w:tcPr>
           <w:p>
             <w:pPr>
-              <w:keepNext w:val="0"/>
               <w:spacing w:after="20" w:line="240" w:lineRule="auto"/>
               <w:jc w:val="center"/>
             </w:pPr>
@@ -3748,7 +3494,6 @@
           </w:tcPr>
           <w:p>
             <w:pPr>
-              <w:keepNext w:val="0"/>
               <w:spacing w:after="20" w:line="240" w:lineRule="auto"/>
               <w:jc w:val="center"/>
             </w:pPr>
@@ -3774,7 +3519,6 @@
           </w:tcPr>
           <w:p>
             <w:pPr>
-              <w:keepNext w:val="0"/>
               <w:spacing w:after="20" w:line="240" w:lineRule="auto"/>
               <w:jc w:val="center"/>
             </w:pPr>
@@ -3806,7 +3550,6 @@
           </w:tcPr>
           <w:p>
             <w:pPr>
-              <w:keepNext w:val="0"/>
               <w:spacing w:after="20" w:line="240" w:lineRule="auto"/>
             </w:pPr>
             <w:r>
@@ -3831,7 +3574,6 @@
           </w:tcPr>
           <w:p>
             <w:pPr>
-              <w:keepNext w:val="0"/>
               <w:spacing w:after="20" w:line="240" w:lineRule="auto"/>
               <w:jc w:val="center"/>
             </w:pPr>
@@ -3857,7 +3599,6 @@
           </w:tcPr>
           <w:p>
             <w:pPr>
-              <w:keepNext w:val="0"/>
               <w:spacing w:after="20" w:line="240" w:lineRule="auto"/>
               <w:jc w:val="center"/>
             </w:pPr>
@@ -3883,7 +3624,6 @@
           </w:tcPr>
           <w:p>
             <w:pPr>
-              <w:keepNext w:val="0"/>
               <w:spacing w:after="20" w:line="240" w:lineRule="auto"/>
               <w:jc w:val="center"/>
             </w:pPr>
@@ -3909,7 +3649,6 @@
           </w:tcPr>
           <w:p>
             <w:pPr>
-              <w:keepNext w:val="0"/>
               <w:spacing w:after="20" w:line="240" w:lineRule="auto"/>
               <w:jc w:val="center"/>
             </w:pPr>
@@ -3941,7 +3680,6 @@
           </w:tcPr>
           <w:p>
             <w:pPr>
-              <w:keepNext w:val="0"/>
               <w:spacing w:after="20" w:line="240" w:lineRule="auto"/>
             </w:pPr>
             <w:r>
@@ -3966,7 +3704,6 @@
           </w:tcPr>
           <w:p>
             <w:pPr>
-              <w:keepNext w:val="0"/>
               <w:spacing w:after="20" w:line="240" w:lineRule="auto"/>
               <w:jc w:val="center"/>
             </w:pPr>
@@ -3992,7 +3729,6 @@
           </w:tcPr>
           <w:p>
             <w:pPr>
-              <w:keepNext w:val="0"/>
               <w:spacing w:after="20" w:line="240" w:lineRule="auto"/>
               <w:jc w:val="center"/>
             </w:pPr>
@@ -4018,7 +3754,6 @@
           </w:tcPr>
           <w:p>
             <w:pPr>
-              <w:keepNext w:val="0"/>
               <w:spacing w:after="20" w:line="240" w:lineRule="auto"/>
               <w:jc w:val="center"/>
             </w:pPr>
@@ -4044,7 +3779,6 @@
           </w:tcPr>
           <w:p>
             <w:pPr>
-              <w:keepNext w:val="0"/>
               <w:spacing w:after="20" w:line="240" w:lineRule="auto"/>
               <w:jc w:val="center"/>
             </w:pPr>
@@ -4076,7 +3810,6 @@
           </w:tcPr>
           <w:p>
             <w:pPr>
-              <w:keepNext w:val="0"/>
               <w:spacing w:after="20" w:line="240" w:lineRule="auto"/>
             </w:pPr>
             <w:r>
@@ -4101,7 +3834,6 @@
           </w:tcPr>
           <w:p>
             <w:pPr>
-              <w:keepNext w:val="0"/>
               <w:spacing w:after="20" w:line="240" w:lineRule="auto"/>
               <w:jc w:val="center"/>
             </w:pPr>
@@ -4127,7 +3859,6 @@
           </w:tcPr>
           <w:p>
             <w:pPr>
-              <w:keepNext w:val="0"/>
               <w:spacing w:after="20" w:line="240" w:lineRule="auto"/>
               <w:jc w:val="center"/>
             </w:pPr>
@@ -4153,7 +3884,6 @@
           </w:tcPr>
           <w:p>
             <w:pPr>
-              <w:keepNext w:val="0"/>
               <w:spacing w:after="20" w:line="240" w:lineRule="auto"/>
               <w:jc w:val="center"/>
             </w:pPr>
@@ -4179,7 +3909,6 @@
           </w:tcPr>
           <w:p>
             <w:pPr>
-              <w:keepNext w:val="0"/>
               <w:spacing w:after="20" w:line="240" w:lineRule="auto"/>
               <w:jc w:val="center"/>
             </w:pPr>
@@ -4215,7 +3944,6 @@
     </w:p>
     <w:p>
       <w:r>
-        <w:rPr/>
         <w:t>The paired difference in median absolute relative error (corrected model minus bytes-only baseline) was -38.23 percentage points, with a conditional 95% interval from -38.63 to -36.50 percentage points. Negative values favor the corrected model. The no-intercept and no-record-validation ablations in Table 5 show the contribution of these terms under joint refitting; they are not causal decompositions of execution time.</w:t>
       </w:r>
     </w:p>
@@ -4278,7 +4006,6 @@
           </w:tcPr>
           <w:p>
             <w:pPr>
-              <w:keepNext w:val="0"/>
               <w:spacing w:after="20" w:line="240" w:lineRule="auto"/>
             </w:pPr>
             <w:r>
@@ -4304,7 +4031,6 @@
           </w:tcPr>
           <w:p>
             <w:pPr>
-              <w:keepNext w:val="0"/>
               <w:spacing w:after="20" w:line="240" w:lineRule="auto"/>
               <w:jc w:val="center"/>
             </w:pPr>
@@ -4331,7 +4057,6 @@
           </w:tcPr>
           <w:p>
             <w:pPr>
-              <w:keepNext w:val="0"/>
               <w:spacing w:after="20" w:line="240" w:lineRule="auto"/>
               <w:jc w:val="center"/>
             </w:pPr>
@@ -4358,7 +4083,6 @@
           </w:tcPr>
           <w:p>
             <w:pPr>
-              <w:keepNext w:val="0"/>
               <w:spacing w:after="20" w:line="240" w:lineRule="auto"/>
               <w:jc w:val="center"/>
             </w:pPr>
@@ -4385,7 +4109,6 @@
           </w:tcPr>
           <w:p>
             <w:pPr>
-              <w:keepNext w:val="0"/>
               <w:spacing w:after="20" w:line="240" w:lineRule="auto"/>
               <w:jc w:val="center"/>
             </w:pPr>
@@ -4412,7 +4135,6 @@
           </w:tcPr>
           <w:p>
             <w:pPr>
-              <w:keepNext w:val="0"/>
               <w:spacing w:after="20" w:line="240" w:lineRule="auto"/>
               <w:jc w:val="center"/>
             </w:pPr>
@@ -4445,7 +4167,6 @@
           </w:tcPr>
           <w:p>
             <w:pPr>
-              <w:keepNext w:val="0"/>
               <w:spacing w:after="20" w:line="240" w:lineRule="auto"/>
             </w:pPr>
             <w:r>
@@ -4470,7 +4191,6 @@
           </w:tcPr>
           <w:p>
             <w:pPr>
-              <w:keepNext w:val="0"/>
               <w:spacing w:after="20" w:line="240" w:lineRule="auto"/>
               <w:jc w:val="center"/>
             </w:pPr>
@@ -4496,7 +4216,6 @@
           </w:tcPr>
           <w:p>
             <w:pPr>
-              <w:keepNext w:val="0"/>
               <w:spacing w:after="20" w:line="240" w:lineRule="auto"/>
               <w:jc w:val="center"/>
             </w:pPr>
@@ -4522,7 +4241,6 @@
           </w:tcPr>
           <w:p>
             <w:pPr>
-              <w:keepNext w:val="0"/>
               <w:spacing w:after="20" w:line="240" w:lineRule="auto"/>
               <w:jc w:val="center"/>
             </w:pPr>
@@ -4548,7 +4266,6 @@
           </w:tcPr>
           <w:p>
             <w:pPr>
-              <w:keepNext w:val="0"/>
               <w:spacing w:after="20" w:line="240" w:lineRule="auto"/>
               <w:jc w:val="center"/>
             </w:pPr>
@@ -4574,7 +4291,6 @@
           </w:tcPr>
           <w:p>
             <w:pPr>
-              <w:keepNext w:val="0"/>
               <w:spacing w:after="20" w:line="240" w:lineRule="auto"/>
               <w:jc w:val="center"/>
             </w:pPr>
@@ -4606,14 +4322,12 @@
           </w:tcPr>
           <w:p>
             <w:pPr>
-              <w:keepNext w:val="0"/>
-              <w:spacing w:after="20" w:line="240" w:lineRule="auto"/>
-            </w:pPr>
-            <w:r>
-              <w:rPr>
-                <w:sz w:val="16"/>
-              </w:rPr>
-              <w:lastRenderedPageBreak/>
+              <w:spacing w:after="20" w:line="240" w:lineRule="auto"/>
+            </w:pPr>
+            <w:r>
+              <w:rPr>
+                <w:sz w:val="16"/>
+              </w:rPr>
               <w:t>N selective</w:t>
             </w:r>
           </w:p>
@@ -4632,7 +4346,6 @@
           </w:tcPr>
           <w:p>
             <w:pPr>
-              <w:keepNext w:val="0"/>
               <w:spacing w:after="20" w:line="240" w:lineRule="auto"/>
               <w:jc w:val="center"/>
             </w:pPr>
@@ -4658,7 +4371,6 @@
           </w:tcPr>
           <w:p>
             <w:pPr>
-              <w:keepNext w:val="0"/>
               <w:spacing w:after="20" w:line="240" w:lineRule="auto"/>
               <w:jc w:val="center"/>
             </w:pPr>
@@ -4684,7 +4396,6 @@
           </w:tcPr>
           <w:p>
             <w:pPr>
-              <w:keepNext w:val="0"/>
               <w:spacing w:after="20" w:line="240" w:lineRule="auto"/>
               <w:jc w:val="center"/>
             </w:pPr>
@@ -4710,7 +4421,6 @@
           </w:tcPr>
           <w:p>
             <w:pPr>
-              <w:keepNext w:val="0"/>
               <w:spacing w:after="20" w:line="240" w:lineRule="auto"/>
               <w:jc w:val="center"/>
             </w:pPr>
@@ -4736,7 +4446,6 @@
           </w:tcPr>
           <w:p>
             <w:pPr>
-              <w:keepNext w:val="0"/>
               <w:spacing w:after="20" w:line="240" w:lineRule="auto"/>
               <w:jc w:val="center"/>
             </w:pPr>
@@ -4768,7 +4477,6 @@
           </w:tcPr>
           <w:p>
             <w:pPr>
-              <w:keepNext w:val="0"/>
               <w:spacing w:after="20" w:line="240" w:lineRule="auto"/>
             </w:pPr>
             <w:r>
@@ -4793,7 +4501,6 @@
           </w:tcPr>
           <w:p>
             <w:pPr>
-              <w:keepNext w:val="0"/>
               <w:spacing w:after="20" w:line="240" w:lineRule="auto"/>
               <w:jc w:val="center"/>
             </w:pPr>
@@ -4819,7 +4526,6 @@
           </w:tcPr>
           <w:p>
             <w:pPr>
-              <w:keepNext w:val="0"/>
               <w:spacing w:after="20" w:line="240" w:lineRule="auto"/>
               <w:jc w:val="center"/>
             </w:pPr>
@@ -4845,7 +4551,6 @@
           </w:tcPr>
           <w:p>
             <w:pPr>
-              <w:keepNext w:val="0"/>
               <w:spacing w:after="20" w:line="240" w:lineRule="auto"/>
               <w:jc w:val="center"/>
             </w:pPr>
@@ -4871,7 +4576,6 @@
           </w:tcPr>
           <w:p>
             <w:pPr>
-              <w:keepNext w:val="0"/>
               <w:spacing w:after="20" w:line="240" w:lineRule="auto"/>
               <w:jc w:val="center"/>
             </w:pPr>
@@ -4897,7 +4601,6 @@
           </w:tcPr>
           <w:p>
             <w:pPr>
-              <w:keepNext w:val="0"/>
               <w:spacing w:after="20" w:line="240" w:lineRule="auto"/>
               <w:jc w:val="center"/>
             </w:pPr>
@@ -4929,7 +4632,6 @@
           </w:tcPr>
           <w:p>
             <w:pPr>
-              <w:keepNext w:val="0"/>
               <w:spacing w:after="20" w:line="240" w:lineRule="auto"/>
             </w:pPr>
             <w:r>
@@ -4954,7 +4656,6 @@
           </w:tcPr>
           <w:p>
             <w:pPr>
-              <w:keepNext w:val="0"/>
               <w:spacing w:after="20" w:line="240" w:lineRule="auto"/>
               <w:jc w:val="center"/>
             </w:pPr>
@@ -4980,7 +4681,6 @@
           </w:tcPr>
           <w:p>
             <w:pPr>
-              <w:keepNext w:val="0"/>
               <w:spacing w:after="20" w:line="240" w:lineRule="auto"/>
               <w:jc w:val="center"/>
             </w:pPr>
@@ -5006,7 +4706,6 @@
           </w:tcPr>
           <w:p>
             <w:pPr>
-              <w:keepNext w:val="0"/>
               <w:spacing w:after="20" w:line="240" w:lineRule="auto"/>
               <w:jc w:val="center"/>
             </w:pPr>
@@ -5032,7 +4731,6 @@
           </w:tcPr>
           <w:p>
             <w:pPr>
-              <w:keepNext w:val="0"/>
               <w:spacing w:after="20" w:line="240" w:lineRule="auto"/>
               <w:jc w:val="center"/>
             </w:pPr>
@@ -5058,7 +4756,6 @@
           </w:tcPr>
           <w:p>
             <w:pPr>
-              <w:keepNext w:val="0"/>
               <w:spacing w:after="20" w:line="240" w:lineRule="auto"/>
               <w:jc w:val="center"/>
             </w:pPr>
@@ -5090,7 +4787,6 @@
           </w:tcPr>
           <w:p>
             <w:pPr>
-              <w:keepNext w:val="0"/>
               <w:spacing w:after="20" w:line="240" w:lineRule="auto"/>
             </w:pPr>
             <w:r>
@@ -5115,7 +4811,6 @@
           </w:tcPr>
           <w:p>
             <w:pPr>
-              <w:keepNext w:val="0"/>
               <w:spacing w:after="20" w:line="240" w:lineRule="auto"/>
               <w:jc w:val="center"/>
             </w:pPr>
@@ -5141,7 +4836,6 @@
           </w:tcPr>
           <w:p>
             <w:pPr>
-              <w:keepNext w:val="0"/>
               <w:spacing w:after="20" w:line="240" w:lineRule="auto"/>
               <w:jc w:val="center"/>
             </w:pPr>
@@ -5167,7 +4861,6 @@
           </w:tcPr>
           <w:p>
             <w:pPr>
-              <w:keepNext w:val="0"/>
               <w:spacing w:after="20" w:line="240" w:lineRule="auto"/>
               <w:jc w:val="center"/>
             </w:pPr>
@@ -5193,7 +4886,6 @@
           </w:tcPr>
           <w:p>
             <w:pPr>
-              <w:keepNext w:val="0"/>
               <w:spacing w:after="20" w:line="240" w:lineRule="auto"/>
               <w:jc w:val="center"/>
             </w:pPr>
@@ -5219,7 +4911,6 @@
           </w:tcPr>
           <w:p>
             <w:pPr>
-              <w:keepNext w:val="0"/>
               <w:spacing w:after="20" w:line="240" w:lineRule="auto"/>
               <w:jc w:val="center"/>
             </w:pPr>
@@ -5251,7 +4942,6 @@
           </w:tcPr>
           <w:p>
             <w:pPr>
-              <w:keepNext w:val="0"/>
               <w:spacing w:after="20" w:line="240" w:lineRule="auto"/>
             </w:pPr>
             <w:r>
@@ -5276,7 +4966,6 @@
           </w:tcPr>
           <w:p>
             <w:pPr>
-              <w:keepNext w:val="0"/>
               <w:spacing w:after="20" w:line="240" w:lineRule="auto"/>
               <w:jc w:val="center"/>
             </w:pPr>
@@ -5302,7 +4991,6 @@
           </w:tcPr>
           <w:p>
             <w:pPr>
-              <w:keepNext w:val="0"/>
               <w:spacing w:after="20" w:line="240" w:lineRule="auto"/>
               <w:jc w:val="center"/>
             </w:pPr>
@@ -5328,7 +5016,6 @@
           </w:tcPr>
           <w:p>
             <w:pPr>
-              <w:keepNext w:val="0"/>
               <w:spacing w:after="20" w:line="240" w:lineRule="auto"/>
               <w:jc w:val="center"/>
             </w:pPr>
@@ -5354,7 +5041,6 @@
           </w:tcPr>
           <w:p>
             <w:pPr>
-              <w:keepNext w:val="0"/>
               <w:spacing w:after="20" w:line="240" w:lineRule="auto"/>
               <w:jc w:val="center"/>
             </w:pPr>
@@ -5380,7 +5066,6 @@
           </w:tcPr>
           <w:p>
             <w:pPr>
-              <w:keepNext w:val="0"/>
               <w:spacing w:after="20" w:line="240" w:lineRule="auto"/>
               <w:jc w:val="center"/>
             </w:pPr>
@@ -5412,7 +5097,6 @@
           </w:tcPr>
           <w:p>
             <w:pPr>
-              <w:keepNext w:val="0"/>
               <w:spacing w:after="20" w:line="240" w:lineRule="auto"/>
             </w:pPr>
             <w:r>
@@ -5437,7 +5121,6 @@
           </w:tcPr>
           <w:p>
             <w:pPr>
-              <w:keepNext w:val="0"/>
               <w:spacing w:after="20" w:line="240" w:lineRule="auto"/>
               <w:jc w:val="center"/>
             </w:pPr>
@@ -5463,7 +5146,6 @@
           </w:tcPr>
           <w:p>
             <w:pPr>
-              <w:keepNext w:val="0"/>
               <w:spacing w:after="20" w:line="240" w:lineRule="auto"/>
               <w:jc w:val="center"/>
             </w:pPr>
@@ -5489,7 +5171,6 @@
           </w:tcPr>
           <w:p>
             <w:pPr>
-              <w:keepNext w:val="0"/>
               <w:spacing w:after="20" w:line="240" w:lineRule="auto"/>
               <w:jc w:val="center"/>
             </w:pPr>
@@ -5515,7 +5196,6 @@
           </w:tcPr>
           <w:p>
             <w:pPr>
-              <w:keepNext w:val="0"/>
               <w:spacing w:after="20" w:line="240" w:lineRule="auto"/>
               <w:jc w:val="center"/>
             </w:pPr>
@@ -5541,7 +5221,6 @@
           </w:tcPr>
           <w:p>
             <w:pPr>
-              <w:keepNext w:val="0"/>
               <w:spacing w:after="20" w:line="240" w:lineRule="auto"/>
               <w:jc w:val="center"/>
             </w:pPr>
@@ -5573,7 +5252,6 @@
           </w:tcPr>
           <w:p>
             <w:pPr>
-              <w:keepNext w:val="0"/>
               <w:spacing w:after="20" w:line="240" w:lineRule="auto"/>
             </w:pPr>
             <w:r>
@@ -5598,7 +5276,6 @@
           </w:tcPr>
           <w:p>
             <w:pPr>
-              <w:keepNext w:val="0"/>
               <w:spacing w:after="20" w:line="240" w:lineRule="auto"/>
               <w:jc w:val="center"/>
             </w:pPr>
@@ -5624,7 +5301,6 @@
           </w:tcPr>
           <w:p>
             <w:pPr>
-              <w:keepNext w:val="0"/>
               <w:spacing w:after="20" w:line="240" w:lineRule="auto"/>
               <w:jc w:val="center"/>
             </w:pPr>
@@ -5650,7 +5326,6 @@
           </w:tcPr>
           <w:p>
             <w:pPr>
-              <w:keepNext w:val="0"/>
               <w:spacing w:after="20" w:line="240" w:lineRule="auto"/>
               <w:jc w:val="center"/>
             </w:pPr>
@@ -5676,7 +5351,6 @@
           </w:tcPr>
           <w:p>
             <w:pPr>
-              <w:keepNext w:val="0"/>
               <w:spacing w:after="20" w:line="240" w:lineRule="auto"/>
               <w:jc w:val="center"/>
             </w:pPr>
@@ -5702,7 +5376,6 @@
           </w:tcPr>
           <w:p>
             <w:pPr>
-              <w:keepNext w:val="0"/>
               <w:spacing w:after="20" w:line="240" w:lineRule="auto"/>
               <w:jc w:val="center"/>
             </w:pPr>
@@ -5734,7 +5407,6 @@
           </w:tcPr>
           <w:p>
             <w:pPr>
-              <w:keepNext w:val="0"/>
               <w:spacing w:after="20" w:line="240" w:lineRule="auto"/>
             </w:pPr>
             <w:r>
@@ -5759,7 +5431,6 @@
           </w:tcPr>
           <w:p>
             <w:pPr>
-              <w:keepNext w:val="0"/>
               <w:spacing w:after="20" w:line="240" w:lineRule="auto"/>
               <w:jc w:val="center"/>
             </w:pPr>
@@ -5785,7 +5456,6 @@
           </w:tcPr>
           <w:p>
             <w:pPr>
-              <w:keepNext w:val="0"/>
               <w:spacing w:after="20" w:line="240" w:lineRule="auto"/>
               <w:jc w:val="center"/>
             </w:pPr>
@@ -5811,7 +5481,6 @@
           </w:tcPr>
           <w:p>
             <w:pPr>
-              <w:keepNext w:val="0"/>
               <w:spacing w:after="20" w:line="240" w:lineRule="auto"/>
               <w:jc w:val="center"/>
             </w:pPr>
@@ -5837,7 +5506,6 @@
           </w:tcPr>
           <w:p>
             <w:pPr>
-              <w:keepNext w:val="0"/>
               <w:spacing w:after="20" w:line="240" w:lineRule="auto"/>
               <w:jc w:val="center"/>
             </w:pPr>
@@ -5863,7 +5531,6 @@
           </w:tcPr>
           <w:p>
             <w:pPr>
-              <w:keepNext w:val="0"/>
               <w:spacing w:after="20" w:line="240" w:lineRule="auto"/>
               <w:jc w:val="center"/>
             </w:pPr>
@@ -5895,13 +5562,13 @@
           </w:tcPr>
           <w:p>
             <w:pPr>
-              <w:keepNext w:val="0"/>
-              <w:spacing w:after="20" w:line="240" w:lineRule="auto"/>
-            </w:pPr>
-            <w:r>
-              <w:rPr>
-                <w:sz w:val="16"/>
-              </w:rPr>
+              <w:spacing w:after="20" w:line="240" w:lineRule="auto"/>
+            </w:pPr>
+            <w:r>
+              <w:rPr>
+                <w:sz w:val="16"/>
+              </w:rPr>
+              <w:lastRenderedPageBreak/>
               <w:t>E full</w:t>
             </w:r>
           </w:p>
@@ -5920,7 +5587,6 @@
           </w:tcPr>
           <w:p>
             <w:pPr>
-              <w:keepNext w:val="0"/>
               <w:spacing w:after="20" w:line="240" w:lineRule="auto"/>
               <w:jc w:val="center"/>
             </w:pPr>
@@ -5946,7 +5612,6 @@
           </w:tcPr>
           <w:p>
             <w:pPr>
-              <w:keepNext w:val="0"/>
               <w:spacing w:after="20" w:line="240" w:lineRule="auto"/>
               <w:jc w:val="center"/>
             </w:pPr>
@@ -5972,7 +5637,6 @@
           </w:tcPr>
           <w:p>
             <w:pPr>
-              <w:keepNext w:val="0"/>
               <w:spacing w:after="20" w:line="240" w:lineRule="auto"/>
               <w:jc w:val="center"/>
             </w:pPr>
@@ -5998,7 +5662,6 @@
           </w:tcPr>
           <w:p>
             <w:pPr>
-              <w:keepNext w:val="0"/>
               <w:spacing w:after="20" w:line="240" w:lineRule="auto"/>
               <w:jc w:val="center"/>
             </w:pPr>
@@ -6024,7 +5687,6 @@
           </w:tcPr>
           <w:p>
             <w:pPr>
-              <w:keepNext w:val="0"/>
               <w:spacing w:after="20" w:line="240" w:lineRule="auto"/>
               <w:jc w:val="center"/>
             </w:pPr>
@@ -6056,7 +5718,6 @@
           </w:tcPr>
           <w:p>
             <w:pPr>
-              <w:keepNext w:val="0"/>
               <w:spacing w:after="20" w:line="240" w:lineRule="auto"/>
             </w:pPr>
             <w:r>
@@ -6081,7 +5742,6 @@
           </w:tcPr>
           <w:p>
             <w:pPr>
-              <w:keepNext w:val="0"/>
               <w:spacing w:after="20" w:line="240" w:lineRule="auto"/>
               <w:jc w:val="center"/>
             </w:pPr>
@@ -6107,7 +5767,6 @@
           </w:tcPr>
           <w:p>
             <w:pPr>
-              <w:keepNext w:val="0"/>
               <w:spacing w:after="20" w:line="240" w:lineRule="auto"/>
               <w:jc w:val="center"/>
             </w:pPr>
@@ -6133,7 +5792,6 @@
           </w:tcPr>
           <w:p>
             <w:pPr>
-              <w:keepNext w:val="0"/>
               <w:spacing w:after="20" w:line="240" w:lineRule="auto"/>
               <w:jc w:val="center"/>
             </w:pPr>
@@ -6159,7 +5817,6 @@
           </w:tcPr>
           <w:p>
             <w:pPr>
-              <w:keepNext w:val="0"/>
               <w:spacing w:after="20" w:line="240" w:lineRule="auto"/>
               <w:jc w:val="center"/>
             </w:pPr>
@@ -6185,7 +5842,6 @@
           </w:tcPr>
           <w:p>
             <w:pPr>
-              <w:keepNext w:val="0"/>
               <w:spacing w:after="20" w:line="240" w:lineRule="auto"/>
               <w:jc w:val="center"/>
             </w:pPr>
@@ -6217,7 +5873,6 @@
           </w:tcPr>
           <w:p>
             <w:pPr>
-              <w:keepNext w:val="0"/>
               <w:spacing w:after="20" w:line="240" w:lineRule="auto"/>
             </w:pPr>
             <w:r>
@@ -6242,7 +5897,6 @@
           </w:tcPr>
           <w:p>
             <w:pPr>
-              <w:keepNext w:val="0"/>
               <w:spacing w:after="20" w:line="240" w:lineRule="auto"/>
               <w:jc w:val="center"/>
             </w:pPr>
@@ -6268,7 +5922,6 @@
           </w:tcPr>
           <w:p>
             <w:pPr>
-              <w:keepNext w:val="0"/>
               <w:spacing w:after="20" w:line="240" w:lineRule="auto"/>
               <w:jc w:val="center"/>
             </w:pPr>
@@ -6294,7 +5947,6 @@
           </w:tcPr>
           <w:p>
             <w:pPr>
-              <w:keepNext w:val="0"/>
               <w:spacing w:after="20" w:line="240" w:lineRule="auto"/>
               <w:jc w:val="center"/>
             </w:pPr>
@@ -6320,7 +5972,6 @@
           </w:tcPr>
           <w:p>
             <w:pPr>
-              <w:keepNext w:val="0"/>
               <w:spacing w:after="20" w:line="240" w:lineRule="auto"/>
               <w:jc w:val="center"/>
             </w:pPr>
@@ -6346,7 +5997,6 @@
           </w:tcPr>
           <w:p>
             <w:pPr>
-              <w:keepNext w:val="0"/>
               <w:spacing w:after="20" w:line="240" w:lineRule="auto"/>
               <w:jc w:val="center"/>
             </w:pPr>
@@ -6378,7 +6028,6 @@
           </w:tcPr>
           <w:p>
             <w:pPr>
-              <w:keepNext w:val="0"/>
               <w:spacing w:after="20" w:line="240" w:lineRule="auto"/>
             </w:pPr>
             <w:r>
@@ -6403,7 +6052,6 @@
           </w:tcPr>
           <w:p>
             <w:pPr>
-              <w:keepNext w:val="0"/>
               <w:spacing w:after="20" w:line="240" w:lineRule="auto"/>
               <w:jc w:val="center"/>
             </w:pPr>
@@ -6429,7 +6077,6 @@
           </w:tcPr>
           <w:p>
             <w:pPr>
-              <w:keepNext w:val="0"/>
               <w:spacing w:after="20" w:line="240" w:lineRule="auto"/>
               <w:jc w:val="center"/>
             </w:pPr>
@@ -6455,7 +6102,6 @@
           </w:tcPr>
           <w:p>
             <w:pPr>
-              <w:keepNext w:val="0"/>
               <w:spacing w:after="20" w:line="240" w:lineRule="auto"/>
               <w:jc w:val="center"/>
             </w:pPr>
@@ -6481,7 +6127,6 @@
           </w:tcPr>
           <w:p>
             <w:pPr>
-              <w:keepNext w:val="0"/>
               <w:spacing w:after="20" w:line="240" w:lineRule="auto"/>
               <w:jc w:val="center"/>
             </w:pPr>
@@ -6507,7 +6152,6 @@
           </w:tcPr>
           <w:p>
             <w:pPr>
-              <w:keepNext w:val="0"/>
               <w:spacing w:after="20" w:line="240" w:lineRule="auto"/>
               <w:jc w:val="center"/>
             </w:pPr>
@@ -6539,7 +6183,6 @@
           </w:tcPr>
           <w:p>
             <w:pPr>
-              <w:keepNext w:val="0"/>
               <w:spacing w:after="20" w:line="240" w:lineRule="auto"/>
             </w:pPr>
             <w:r>
@@ -6564,7 +6207,6 @@
           </w:tcPr>
           <w:p>
             <w:pPr>
-              <w:keepNext w:val="0"/>
               <w:spacing w:after="20" w:line="240" w:lineRule="auto"/>
               <w:jc w:val="center"/>
             </w:pPr>
@@ -6590,7 +6232,6 @@
           </w:tcPr>
           <w:p>
             <w:pPr>
-              <w:keepNext w:val="0"/>
               <w:spacing w:after="20" w:line="240" w:lineRule="auto"/>
               <w:jc w:val="center"/>
             </w:pPr>
@@ -6616,7 +6257,6 @@
           </w:tcPr>
           <w:p>
             <w:pPr>
-              <w:keepNext w:val="0"/>
               <w:spacing w:after="20" w:line="240" w:lineRule="auto"/>
               <w:jc w:val="center"/>
             </w:pPr>
@@ -6642,7 +6282,6 @@
           </w:tcPr>
           <w:p>
             <w:pPr>
-              <w:keepNext w:val="0"/>
               <w:spacing w:after="20" w:line="240" w:lineRule="auto"/>
               <w:jc w:val="center"/>
             </w:pPr>
@@ -6668,7 +6307,6 @@
           </w:tcPr>
           <w:p>
             <w:pPr>
-              <w:keepNext w:val="0"/>
               <w:spacing w:after="20" w:line="240" w:lineRule="auto"/>
               <w:jc w:val="center"/>
             </w:pPr>
@@ -6700,7 +6338,6 @@
           </w:tcPr>
           <w:p>
             <w:pPr>
-              <w:keepNext w:val="0"/>
               <w:spacing w:after="20" w:line="240" w:lineRule="auto"/>
             </w:pPr>
             <w:r>
@@ -6725,7 +6362,6 @@
           </w:tcPr>
           <w:p>
             <w:pPr>
-              <w:keepNext w:val="0"/>
               <w:spacing w:after="20" w:line="240" w:lineRule="auto"/>
               <w:jc w:val="center"/>
             </w:pPr>
@@ -6751,7 +6387,6 @@
           </w:tcPr>
           <w:p>
             <w:pPr>
-              <w:keepNext w:val="0"/>
               <w:spacing w:after="20" w:line="240" w:lineRule="auto"/>
               <w:jc w:val="center"/>
             </w:pPr>
@@ -6777,7 +6412,6 @@
           </w:tcPr>
           <w:p>
             <w:pPr>
-              <w:keepNext w:val="0"/>
               <w:spacing w:after="20" w:line="240" w:lineRule="auto"/>
               <w:jc w:val="center"/>
             </w:pPr>
@@ -6803,7 +6437,6 @@
           </w:tcPr>
           <w:p>
             <w:pPr>
-              <w:keepNext w:val="0"/>
               <w:spacing w:after="20" w:line="240" w:lineRule="auto"/>
               <w:jc w:val="center"/>
             </w:pPr>
@@ -6829,7 +6462,6 @@
           </w:tcPr>
           <w:p>
             <w:pPr>
-              <w:keepNext w:val="0"/>
               <w:spacing w:after="20" w:line="240" w:lineRule="auto"/>
               <w:jc w:val="center"/>
             </w:pPr>
@@ -6861,7 +6493,6 @@
           </w:tcPr>
           <w:p>
             <w:pPr>
-              <w:keepNext w:val="0"/>
               <w:spacing w:after="20" w:line="240" w:lineRule="auto"/>
             </w:pPr>
             <w:r>
@@ -6886,7 +6517,6 @@
           </w:tcPr>
           <w:p>
             <w:pPr>
-              <w:keepNext w:val="0"/>
               <w:spacing w:after="20" w:line="240" w:lineRule="auto"/>
               <w:jc w:val="center"/>
             </w:pPr>
@@ -6912,7 +6542,6 @@
           </w:tcPr>
           <w:p>
             <w:pPr>
-              <w:keepNext w:val="0"/>
               <w:spacing w:after="20" w:line="240" w:lineRule="auto"/>
               <w:jc w:val="center"/>
             </w:pPr>
@@ -6938,7 +6567,6 @@
           </w:tcPr>
           <w:p>
             <w:pPr>
-              <w:keepNext w:val="0"/>
               <w:spacing w:after="20" w:line="240" w:lineRule="auto"/>
               <w:jc w:val="center"/>
             </w:pPr>
@@ -6964,7 +6592,6 @@
           </w:tcPr>
           <w:p>
             <w:pPr>
-              <w:keepNext w:val="0"/>
               <w:spacing w:after="20" w:line="240" w:lineRule="auto"/>
               <w:jc w:val="center"/>
             </w:pPr>
@@ -6990,7 +6617,6 @@
           </w:tcPr>
           <w:p>
             <w:pPr>
-              <w:keepNext w:val="0"/>
               <w:spacing w:after="20" w:line="240" w:lineRule="auto"/>
               <w:jc w:val="center"/>
             </w:pPr>
@@ -7022,7 +6648,6 @@
           </w:tcPr>
           <w:p>
             <w:pPr>
-              <w:keepNext w:val="0"/>
               <w:spacing w:after="20" w:line="240" w:lineRule="auto"/>
             </w:pPr>
             <w:r>
@@ -7047,7 +6672,6 @@
           </w:tcPr>
           <w:p>
             <w:pPr>
-              <w:keepNext w:val="0"/>
               <w:spacing w:after="20" w:line="240" w:lineRule="auto"/>
               <w:jc w:val="center"/>
             </w:pPr>
@@ -7073,7 +6697,6 @@
           </w:tcPr>
           <w:p>
             <w:pPr>
-              <w:keepNext w:val="0"/>
               <w:spacing w:after="20" w:line="240" w:lineRule="auto"/>
               <w:jc w:val="center"/>
             </w:pPr>
@@ -7099,7 +6722,6 @@
           </w:tcPr>
           <w:p>
             <w:pPr>
-              <w:keepNext w:val="0"/>
               <w:spacing w:after="20" w:line="240" w:lineRule="auto"/>
               <w:jc w:val="center"/>
             </w:pPr>
@@ -7125,7 +6747,6 @@
           </w:tcPr>
           <w:p>
             <w:pPr>
-              <w:keepNext w:val="0"/>
               <w:spacing w:after="20" w:line="240" w:lineRule="auto"/>
               <w:jc w:val="center"/>
             </w:pPr>
@@ -7151,7 +6772,6 @@
           </w:tcPr>
           <w:p>
             <w:pPr>
-              <w:keepNext w:val="0"/>
               <w:spacing w:after="20" w:line="240" w:lineRule="auto"/>
               <w:jc w:val="center"/>
             </w:pPr>
@@ -7183,7 +6803,6 @@
           </w:tcPr>
           <w:p>
             <w:pPr>
-              <w:keepNext w:val="0"/>
               <w:spacing w:after="20" w:line="240" w:lineRule="auto"/>
             </w:pPr>
             <w:r>
@@ -7208,7 +6827,6 @@
           </w:tcPr>
           <w:p>
             <w:pPr>
-              <w:keepNext w:val="0"/>
               <w:spacing w:after="20" w:line="240" w:lineRule="auto"/>
               <w:jc w:val="center"/>
             </w:pPr>
@@ -7234,7 +6852,6 @@
           </w:tcPr>
           <w:p>
             <w:pPr>
-              <w:keepNext w:val="0"/>
               <w:spacing w:after="20" w:line="240" w:lineRule="auto"/>
               <w:jc w:val="center"/>
             </w:pPr>
@@ -7260,7 +6877,6 @@
           </w:tcPr>
           <w:p>
             <w:pPr>
-              <w:keepNext w:val="0"/>
               <w:spacing w:after="20" w:line="240" w:lineRule="auto"/>
               <w:jc w:val="center"/>
             </w:pPr>
@@ -7286,7 +6902,6 @@
           </w:tcPr>
           <w:p>
             <w:pPr>
-              <w:keepNext w:val="0"/>
               <w:spacing w:after="20" w:line="240" w:lineRule="auto"/>
               <w:jc w:val="center"/>
             </w:pPr>
@@ -7312,7 +6927,6 @@
           </w:tcPr>
           <w:p>
             <w:pPr>
-              <w:keepNext w:val="0"/>
               <w:spacing w:after="20" w:line="240" w:lineRule="auto"/>
               <w:jc w:val="center"/>
             </w:pPr>
@@ -7390,7 +7004,6 @@
           </w:tcPr>
           <w:p>
             <w:pPr>
-              <w:keepNext w:val="0"/>
               <w:spacing w:after="20" w:line="240" w:lineRule="auto"/>
             </w:pPr>
             <w:r>
@@ -7416,7 +7029,6 @@
           </w:tcPr>
           <w:p>
             <w:pPr>
-              <w:keepNext w:val="0"/>
               <w:spacing w:after="20" w:line="240" w:lineRule="auto"/>
               <w:jc w:val="center"/>
             </w:pPr>
@@ -7443,7 +7055,6 @@
           </w:tcPr>
           <w:p>
             <w:pPr>
-              <w:keepNext w:val="0"/>
               <w:spacing w:after="20" w:line="240" w:lineRule="auto"/>
               <w:jc w:val="center"/>
             </w:pPr>
@@ -7470,7 +7081,6 @@
           </w:tcPr>
           <w:p>
             <w:pPr>
-              <w:keepNext w:val="0"/>
               <w:spacing w:after="20" w:line="240" w:lineRule="auto"/>
               <w:jc w:val="center"/>
             </w:pPr>
@@ -7497,7 +7107,6 @@
           </w:tcPr>
           <w:p>
             <w:pPr>
-              <w:keepNext w:val="0"/>
               <w:spacing w:after="20" w:line="240" w:lineRule="auto"/>
               <w:jc w:val="center"/>
             </w:pPr>
@@ -7524,7 +7133,6 @@
           </w:tcPr>
           <w:p>
             <w:pPr>
-              <w:keepNext w:val="0"/>
               <w:spacing w:after="20" w:line="240" w:lineRule="auto"/>
               <w:jc w:val="center"/>
             </w:pPr>
@@ -7557,7 +7165,6 @@
           </w:tcPr>
           <w:p>
             <w:pPr>
-              <w:keepNext w:val="0"/>
               <w:spacing w:after="20" w:line="240" w:lineRule="auto"/>
             </w:pPr>
             <w:r>
@@ -7582,7 +7189,6 @@
           </w:tcPr>
           <w:p>
             <w:pPr>
-              <w:keepNext w:val="0"/>
               <w:spacing w:after="20" w:line="240" w:lineRule="auto"/>
               <w:jc w:val="center"/>
             </w:pPr>
@@ -7608,7 +7214,6 @@
           </w:tcPr>
           <w:p>
             <w:pPr>
-              <w:keepNext w:val="0"/>
               <w:spacing w:after="20" w:line="240" w:lineRule="auto"/>
               <w:jc w:val="center"/>
             </w:pPr>
@@ -7634,7 +7239,6 @@
           </w:tcPr>
           <w:p>
             <w:pPr>
-              <w:keepNext w:val="0"/>
               <w:spacing w:after="20" w:line="240" w:lineRule="auto"/>
               <w:jc w:val="center"/>
             </w:pPr>
@@ -7660,7 +7264,6 @@
           </w:tcPr>
           <w:p>
             <w:pPr>
-              <w:keepNext w:val="0"/>
               <w:spacing w:after="20" w:line="240" w:lineRule="auto"/>
               <w:jc w:val="center"/>
             </w:pPr>
@@ -7686,7 +7289,6 @@
           </w:tcPr>
           <w:p>
             <w:pPr>
-              <w:keepNext w:val="0"/>
               <w:spacing w:after="20" w:line="240" w:lineRule="auto"/>
               <w:jc w:val="center"/>
             </w:pPr>
@@ -7718,7 +7320,6 @@
           </w:tcPr>
           <w:p>
             <w:pPr>
-              <w:keepNext w:val="0"/>
               <w:spacing w:after="20" w:line="240" w:lineRule="auto"/>
             </w:pPr>
             <w:r>
@@ -7743,7 +7344,6 @@
           </w:tcPr>
           <w:p>
             <w:pPr>
-              <w:keepNext w:val="0"/>
               <w:spacing w:after="20" w:line="240" w:lineRule="auto"/>
               <w:jc w:val="center"/>
             </w:pPr>
@@ -7769,7 +7369,6 @@
           </w:tcPr>
           <w:p>
             <w:pPr>
-              <w:keepNext w:val="0"/>
               <w:spacing w:after="20" w:line="240" w:lineRule="auto"/>
               <w:jc w:val="center"/>
             </w:pPr>
@@ -7795,7 +7394,6 @@
           </w:tcPr>
           <w:p>
             <w:pPr>
-              <w:keepNext w:val="0"/>
               <w:spacing w:after="20" w:line="240" w:lineRule="auto"/>
               <w:jc w:val="center"/>
             </w:pPr>
@@ -7821,7 +7419,6 @@
           </w:tcPr>
           <w:p>
             <w:pPr>
-              <w:keepNext w:val="0"/>
               <w:spacing w:after="20" w:line="240" w:lineRule="auto"/>
               <w:jc w:val="center"/>
             </w:pPr>
@@ -7847,7 +7444,6 @@
           </w:tcPr>
           <w:p>
             <w:pPr>
-              <w:keepNext w:val="0"/>
               <w:spacing w:after="20" w:line="240" w:lineRule="auto"/>
               <w:jc w:val="center"/>
             </w:pPr>
@@ -7879,7 +7475,6 @@
           </w:tcPr>
           <w:p>
             <w:pPr>
-              <w:keepNext w:val="0"/>
               <w:spacing w:after="20" w:line="240" w:lineRule="auto"/>
             </w:pPr>
             <w:r>
@@ -7904,7 +7499,6 @@
           </w:tcPr>
           <w:p>
             <w:pPr>
-              <w:keepNext w:val="0"/>
               <w:spacing w:after="20" w:line="240" w:lineRule="auto"/>
               <w:jc w:val="center"/>
             </w:pPr>
@@ -7930,7 +7524,6 @@
           </w:tcPr>
           <w:p>
             <w:pPr>
-              <w:keepNext w:val="0"/>
               <w:spacing w:after="20" w:line="240" w:lineRule="auto"/>
               <w:jc w:val="center"/>
             </w:pPr>
@@ -7956,7 +7549,6 @@
           </w:tcPr>
           <w:p>
             <w:pPr>
-              <w:keepNext w:val="0"/>
               <w:spacing w:after="20" w:line="240" w:lineRule="auto"/>
               <w:jc w:val="center"/>
             </w:pPr>
@@ -7982,7 +7574,6 @@
           </w:tcPr>
           <w:p>
             <w:pPr>
-              <w:keepNext w:val="0"/>
               <w:spacing w:after="20" w:line="240" w:lineRule="auto"/>
               <w:jc w:val="center"/>
             </w:pPr>
@@ -8008,7 +7599,6 @@
           </w:tcPr>
           <w:p>
             <w:pPr>
-              <w:keepNext w:val="0"/>
               <w:spacing w:after="20" w:line="240" w:lineRule="auto"/>
               <w:jc w:val="center"/>
             </w:pPr>
@@ -8040,7 +7630,6 @@
           </w:tcPr>
           <w:p>
             <w:pPr>
-              <w:keepNext w:val="0"/>
               <w:spacing w:after="20" w:line="240" w:lineRule="auto"/>
             </w:pPr>
             <w:r>
@@ -8065,7 +7654,6 @@
           </w:tcPr>
           <w:p>
             <w:pPr>
-              <w:keepNext w:val="0"/>
               <w:spacing w:after="20" w:line="240" w:lineRule="auto"/>
               <w:jc w:val="center"/>
             </w:pPr>
@@ -8091,7 +7679,6 @@
           </w:tcPr>
           <w:p>
             <w:pPr>
-              <w:keepNext w:val="0"/>
               <w:spacing w:after="20" w:line="240" w:lineRule="auto"/>
               <w:jc w:val="center"/>
             </w:pPr>
@@ -8117,7 +7704,6 @@
           </w:tcPr>
           <w:p>
             <w:pPr>
-              <w:keepNext w:val="0"/>
               <w:spacing w:after="20" w:line="240" w:lineRule="auto"/>
               <w:jc w:val="center"/>
             </w:pPr>
@@ -8143,7 +7729,6 @@
           </w:tcPr>
           <w:p>
             <w:pPr>
-              <w:keepNext w:val="0"/>
               <w:spacing w:after="20" w:line="240" w:lineRule="auto"/>
               <w:jc w:val="center"/>
             </w:pPr>
@@ -8169,7 +7754,6 @@
           </w:tcPr>
           <w:p>
             <w:pPr>
-              <w:keepNext w:val="0"/>
               <w:spacing w:after="20" w:line="240" w:lineRule="auto"/>
               <w:jc w:val="center"/>
             </w:pPr>
@@ -8201,7 +7785,6 @@
           </w:tcPr>
           <w:p>
             <w:pPr>
-              <w:keepNext w:val="0"/>
               <w:spacing w:after="20" w:line="240" w:lineRule="auto"/>
             </w:pPr>
             <w:r>
@@ -8226,7 +7809,6 @@
           </w:tcPr>
           <w:p>
             <w:pPr>
-              <w:keepNext w:val="0"/>
               <w:spacing w:after="20" w:line="240" w:lineRule="auto"/>
               <w:jc w:val="center"/>
             </w:pPr>
@@ -8252,7 +7834,6 @@
           </w:tcPr>
           <w:p>
             <w:pPr>
-              <w:keepNext w:val="0"/>
               <w:spacing w:after="20" w:line="240" w:lineRule="auto"/>
               <w:jc w:val="center"/>
             </w:pPr>
@@ -8278,7 +7859,6 @@
           </w:tcPr>
           <w:p>
             <w:pPr>
-              <w:keepNext w:val="0"/>
               <w:spacing w:after="20" w:line="240" w:lineRule="auto"/>
               <w:jc w:val="center"/>
             </w:pPr>
@@ -8304,7 +7884,6 @@
           </w:tcPr>
           <w:p>
             <w:pPr>
-              <w:keepNext w:val="0"/>
               <w:spacing w:after="20" w:line="240" w:lineRule="auto"/>
               <w:jc w:val="center"/>
             </w:pPr>
@@ -8330,7 +7909,6 @@
           </w:tcPr>
           <w:p>
             <w:pPr>
-              <w:keepNext w:val="0"/>
               <w:spacing w:after="20" w:line="240" w:lineRule="auto"/>
               <w:jc w:val="center"/>
             </w:pPr>
@@ -8362,7 +7940,6 @@
           </w:tcPr>
           <w:p>
             <w:pPr>
-              <w:keepNext w:val="0"/>
               <w:spacing w:after="20" w:line="240" w:lineRule="auto"/>
             </w:pPr>
             <w:r>
@@ -8387,7 +7964,6 @@
           </w:tcPr>
           <w:p>
             <w:pPr>
-              <w:keepNext w:val="0"/>
               <w:spacing w:after="20" w:line="240" w:lineRule="auto"/>
               <w:jc w:val="center"/>
             </w:pPr>
@@ -8413,7 +7989,6 @@
           </w:tcPr>
           <w:p>
             <w:pPr>
-              <w:keepNext w:val="0"/>
               <w:spacing w:after="20" w:line="240" w:lineRule="auto"/>
               <w:jc w:val="center"/>
             </w:pPr>
@@ -8439,7 +8014,6 @@
           </w:tcPr>
           <w:p>
             <w:pPr>
-              <w:keepNext w:val="0"/>
               <w:spacing w:after="20" w:line="240" w:lineRule="auto"/>
               <w:jc w:val="center"/>
             </w:pPr>
@@ -8465,7 +8039,6 @@
           </w:tcPr>
           <w:p>
             <w:pPr>
-              <w:keepNext w:val="0"/>
               <w:spacing w:after="20" w:line="240" w:lineRule="auto"/>
               <w:jc w:val="center"/>
             </w:pPr>
@@ -8491,7 +8064,6 @@
           </w:tcPr>
           <w:p>
             <w:pPr>
-              <w:keepNext w:val="0"/>
               <w:spacing w:after="20" w:line="240" w:lineRule="auto"/>
               <w:jc w:val="center"/>
             </w:pPr>
@@ -8523,7 +8095,6 @@
           </w:tcPr>
           <w:p>
             <w:pPr>
-              <w:keepNext w:val="0"/>
               <w:spacing w:after="20" w:line="240" w:lineRule="auto"/>
             </w:pPr>
             <w:r>
@@ -8548,7 +8119,6 @@
           </w:tcPr>
           <w:p>
             <w:pPr>
-              <w:keepNext w:val="0"/>
               <w:spacing w:after="20" w:line="240" w:lineRule="auto"/>
               <w:jc w:val="center"/>
             </w:pPr>
@@ -8574,7 +8144,6 @@
           </w:tcPr>
           <w:p>
             <w:pPr>
-              <w:keepNext w:val="0"/>
               <w:spacing w:after="20" w:line="240" w:lineRule="auto"/>
               <w:jc w:val="center"/>
             </w:pPr>
@@ -8600,7 +8169,6 @@
           </w:tcPr>
           <w:p>
             <w:pPr>
-              <w:keepNext w:val="0"/>
               <w:spacing w:after="20" w:line="240" w:lineRule="auto"/>
               <w:jc w:val="center"/>
             </w:pPr>
@@ -8626,7 +8194,6 @@
           </w:tcPr>
           <w:p>
             <w:pPr>
-              <w:keepNext w:val="0"/>
               <w:spacing w:after="20" w:line="240" w:lineRule="auto"/>
               <w:jc w:val="center"/>
             </w:pPr>
@@ -8652,7 +8219,6 @@
           </w:tcPr>
           <w:p>
             <w:pPr>
-              <w:keepNext w:val="0"/>
               <w:spacing w:after="20" w:line="240" w:lineRule="auto"/>
               <w:jc w:val="center"/>
             </w:pPr>
@@ -8684,7 +8250,6 @@
           </w:tcPr>
           <w:p>
             <w:pPr>
-              <w:keepNext w:val="0"/>
               <w:spacing w:after="20" w:line="240" w:lineRule="auto"/>
             </w:pPr>
             <w:r>
@@ -8709,7 +8274,6 @@
           </w:tcPr>
           <w:p>
             <w:pPr>
-              <w:keepNext w:val="0"/>
               <w:spacing w:after="20" w:line="240" w:lineRule="auto"/>
               <w:jc w:val="center"/>
             </w:pPr>
@@ -8735,7 +8299,6 @@
           </w:tcPr>
           <w:p>
             <w:pPr>
-              <w:keepNext w:val="0"/>
               <w:spacing w:after="20" w:line="240" w:lineRule="auto"/>
               <w:jc w:val="center"/>
             </w:pPr>
@@ -8761,7 +8324,6 @@
           </w:tcPr>
           <w:p>
             <w:pPr>
-              <w:keepNext w:val="0"/>
               <w:spacing w:after="20" w:line="240" w:lineRule="auto"/>
               <w:jc w:val="center"/>
             </w:pPr>
@@ -8787,7 +8349,6 @@
           </w:tcPr>
           <w:p>
             <w:pPr>
-              <w:keepNext w:val="0"/>
               <w:spacing w:after="20" w:line="240" w:lineRule="auto"/>
               <w:jc w:val="center"/>
             </w:pPr>
@@ -8813,7 +8374,6 @@
           </w:tcPr>
           <w:p>
             <w:pPr>
-              <w:keepNext w:val="0"/>
               <w:spacing w:after="20" w:line="240" w:lineRule="auto"/>
               <w:jc w:val="center"/>
             </w:pPr>
@@ -8845,7 +8405,6 @@
           </w:tcPr>
           <w:p>
             <w:pPr>
-              <w:keepNext w:val="0"/>
               <w:spacing w:after="20" w:line="240" w:lineRule="auto"/>
             </w:pPr>
             <w:r>
@@ -8870,7 +8429,6 @@
           </w:tcPr>
           <w:p>
             <w:pPr>
-              <w:keepNext w:val="0"/>
               <w:spacing w:after="20" w:line="240" w:lineRule="auto"/>
               <w:jc w:val="center"/>
             </w:pPr>
@@ -8896,7 +8454,6 @@
           </w:tcPr>
           <w:p>
             <w:pPr>
-              <w:keepNext w:val="0"/>
               <w:spacing w:after="20" w:line="240" w:lineRule="auto"/>
               <w:jc w:val="center"/>
             </w:pPr>
@@ -8922,7 +8479,6 @@
           </w:tcPr>
           <w:p>
             <w:pPr>
-              <w:keepNext w:val="0"/>
               <w:spacing w:after="20" w:line="240" w:lineRule="auto"/>
               <w:jc w:val="center"/>
             </w:pPr>
@@ -8948,7 +8504,6 @@
           </w:tcPr>
           <w:p>
             <w:pPr>
-              <w:keepNext w:val="0"/>
               <w:spacing w:after="20" w:line="240" w:lineRule="auto"/>
               <w:jc w:val="center"/>
             </w:pPr>
@@ -8974,7 +8529,6 @@
           </w:tcPr>
           <w:p>
             <w:pPr>
-              <w:keepNext w:val="0"/>
               <w:spacing w:after="20" w:line="240" w:lineRule="auto"/>
               <w:jc w:val="center"/>
             </w:pPr>
@@ -9006,7 +8560,6 @@
           </w:tcPr>
           <w:p>
             <w:pPr>
-              <w:keepNext w:val="0"/>
               <w:spacing w:after="20" w:line="240" w:lineRule="auto"/>
             </w:pPr>
             <w:r>
@@ -9031,7 +8584,6 @@
           </w:tcPr>
           <w:p>
             <w:pPr>
-              <w:keepNext w:val="0"/>
               <w:spacing w:after="20" w:line="240" w:lineRule="auto"/>
               <w:jc w:val="center"/>
             </w:pPr>
@@ -9057,7 +8609,6 @@
           </w:tcPr>
           <w:p>
             <w:pPr>
-              <w:keepNext w:val="0"/>
               <w:spacing w:after="20" w:line="240" w:lineRule="auto"/>
               <w:jc w:val="center"/>
             </w:pPr>
@@ -9083,7 +8634,6 @@
           </w:tcPr>
           <w:p>
             <w:pPr>
-              <w:keepNext w:val="0"/>
               <w:spacing w:after="20" w:line="240" w:lineRule="auto"/>
               <w:jc w:val="center"/>
             </w:pPr>
@@ -9109,7 +8659,6 @@
           </w:tcPr>
           <w:p>
             <w:pPr>
-              <w:keepNext w:val="0"/>
               <w:spacing w:after="20" w:line="240" w:lineRule="auto"/>
               <w:jc w:val="center"/>
             </w:pPr>
@@ -9135,7 +8684,6 @@
           </w:tcPr>
           <w:p>
             <w:pPr>
-              <w:keepNext w:val="0"/>
               <w:spacing w:after="20" w:line="240" w:lineRule="auto"/>
               <w:jc w:val="center"/>
             </w:pPr>
@@ -9167,7 +8715,6 @@
           </w:tcPr>
           <w:p>
             <w:pPr>
-              <w:keepNext w:val="0"/>
               <w:spacing w:after="20" w:line="240" w:lineRule="auto"/>
             </w:pPr>
             <w:r>
@@ -9192,7 +8739,6 @@
           </w:tcPr>
           <w:p>
             <w:pPr>
-              <w:keepNext w:val="0"/>
               <w:spacing w:after="20" w:line="240" w:lineRule="auto"/>
               <w:jc w:val="center"/>
             </w:pPr>
@@ -9218,7 +8764,6 @@
           </w:tcPr>
           <w:p>
             <w:pPr>
-              <w:keepNext w:val="0"/>
               <w:spacing w:after="20" w:line="240" w:lineRule="auto"/>
               <w:jc w:val="center"/>
             </w:pPr>
@@ -9244,7 +8789,6 @@
           </w:tcPr>
           <w:p>
             <w:pPr>
-              <w:keepNext w:val="0"/>
               <w:spacing w:after="20" w:line="240" w:lineRule="auto"/>
               <w:jc w:val="center"/>
             </w:pPr>
@@ -9270,7 +8814,6 @@
           </w:tcPr>
           <w:p>
             <w:pPr>
-              <w:keepNext w:val="0"/>
               <w:spacing w:after="20" w:line="240" w:lineRule="auto"/>
               <w:jc w:val="center"/>
             </w:pPr>
@@ -9296,7 +8839,6 @@
           </w:tcPr>
           <w:p>
             <w:pPr>
-              <w:keepNext w:val="0"/>
               <w:spacing w:after="20" w:line="240" w:lineRule="auto"/>
               <w:jc w:val="center"/>
             </w:pPr>
@@ -9328,7 +8870,6 @@
           </w:tcPr>
           <w:p>
             <w:pPr>
-              <w:keepNext w:val="0"/>
               <w:spacing w:after="20" w:line="240" w:lineRule="auto"/>
             </w:pPr>
             <w:r>
@@ -9353,7 +8894,6 @@
           </w:tcPr>
           <w:p>
             <w:pPr>
-              <w:keepNext w:val="0"/>
               <w:spacing w:after="20" w:line="240" w:lineRule="auto"/>
               <w:jc w:val="center"/>
             </w:pPr>
@@ -9379,7 +8919,6 @@
           </w:tcPr>
           <w:p>
             <w:pPr>
-              <w:keepNext w:val="0"/>
               <w:spacing w:after="20" w:line="240" w:lineRule="auto"/>
               <w:jc w:val="center"/>
             </w:pPr>
@@ -9405,7 +8944,6 @@
           </w:tcPr>
           <w:p>
             <w:pPr>
-              <w:keepNext w:val="0"/>
               <w:spacing w:after="20" w:line="240" w:lineRule="auto"/>
               <w:jc w:val="center"/>
             </w:pPr>
@@ -9431,7 +8969,6 @@
           </w:tcPr>
           <w:p>
             <w:pPr>
-              <w:keepNext w:val="0"/>
               <w:spacing w:after="20" w:line="240" w:lineRule="auto"/>
               <w:jc w:val="center"/>
             </w:pPr>
@@ -9457,7 +8994,6 @@
           </w:tcPr>
           <w:p>
             <w:pPr>
-              <w:keepNext w:val="0"/>
               <w:spacing w:after="20" w:line="240" w:lineRule="auto"/>
               <w:jc w:val="center"/>
             </w:pPr>
@@ -9489,14 +9025,12 @@
           </w:tcPr>
           <w:p>
             <w:pPr>
-              <w:keepNext w:val="0"/>
-              <w:spacing w:after="20" w:line="240" w:lineRule="auto"/>
-            </w:pPr>
-            <w:r>
-              <w:rPr>
-                <w:sz w:val="16"/>
-              </w:rPr>
-              <w:lastRenderedPageBreak/>
+              <w:spacing w:after="20" w:line="240" w:lineRule="auto"/>
+            </w:pPr>
+            <w:r>
+              <w:rPr>
+                <w:sz w:val="16"/>
+              </w:rPr>
               <w:t>D selective</w:t>
             </w:r>
           </w:p>
@@ -9515,7 +9049,6 @@
           </w:tcPr>
           <w:p>
             <w:pPr>
-              <w:keepNext w:val="0"/>
               <w:spacing w:after="20" w:line="240" w:lineRule="auto"/>
               <w:jc w:val="center"/>
             </w:pPr>
@@ -9541,7 +9074,6 @@
           </w:tcPr>
           <w:p>
             <w:pPr>
-              <w:keepNext w:val="0"/>
               <w:spacing w:after="20" w:line="240" w:lineRule="auto"/>
               <w:jc w:val="center"/>
             </w:pPr>
@@ -9567,7 +9099,6 @@
           </w:tcPr>
           <w:p>
             <w:pPr>
-              <w:keepNext w:val="0"/>
               <w:spacing w:after="20" w:line="240" w:lineRule="auto"/>
               <w:jc w:val="center"/>
             </w:pPr>
@@ -9593,7 +9124,6 @@
           </w:tcPr>
           <w:p>
             <w:pPr>
-              <w:keepNext w:val="0"/>
               <w:spacing w:after="20" w:line="240" w:lineRule="auto"/>
               <w:jc w:val="center"/>
             </w:pPr>
@@ -9619,7 +9149,6 @@
           </w:tcPr>
           <w:p>
             <w:pPr>
-              <w:keepNext w:val="0"/>
               <w:spacing w:after="20" w:line="240" w:lineRule="auto"/>
               <w:jc w:val="center"/>
             </w:pPr>
@@ -9651,7 +9180,6 @@
           </w:tcPr>
           <w:p>
             <w:pPr>
-              <w:keepNext w:val="0"/>
               <w:spacing w:after="20" w:line="240" w:lineRule="auto"/>
             </w:pPr>
             <w:r>
@@ -9676,7 +9204,6 @@
           </w:tcPr>
           <w:p>
             <w:pPr>
-              <w:keepNext w:val="0"/>
               <w:spacing w:after="20" w:line="240" w:lineRule="auto"/>
               <w:jc w:val="center"/>
             </w:pPr>
@@ -9702,7 +9229,6 @@
           </w:tcPr>
           <w:p>
             <w:pPr>
-              <w:keepNext w:val="0"/>
               <w:spacing w:after="20" w:line="240" w:lineRule="auto"/>
               <w:jc w:val="center"/>
             </w:pPr>
@@ -9728,7 +9254,6 @@
           </w:tcPr>
           <w:p>
             <w:pPr>
-              <w:keepNext w:val="0"/>
               <w:spacing w:after="20" w:line="240" w:lineRule="auto"/>
               <w:jc w:val="center"/>
             </w:pPr>
@@ -9754,7 +9279,6 @@
           </w:tcPr>
           <w:p>
             <w:pPr>
-              <w:keepNext w:val="0"/>
               <w:spacing w:after="20" w:line="240" w:lineRule="auto"/>
               <w:jc w:val="center"/>
             </w:pPr>
@@ -9780,7 +9304,6 @@
           </w:tcPr>
           <w:p>
             <w:pPr>
-              <w:keepNext w:val="0"/>
               <w:spacing w:after="20" w:line="240" w:lineRule="auto"/>
               <w:jc w:val="center"/>
             </w:pPr>
@@ -9812,7 +9335,6 @@
           </w:tcPr>
           <w:p>
             <w:pPr>
-              <w:keepNext w:val="0"/>
               <w:spacing w:after="20" w:line="240" w:lineRule="auto"/>
             </w:pPr>
             <w:r>
@@ -9837,7 +9359,6 @@
           </w:tcPr>
           <w:p>
             <w:pPr>
-              <w:keepNext w:val="0"/>
               <w:spacing w:after="20" w:line="240" w:lineRule="auto"/>
               <w:jc w:val="center"/>
             </w:pPr>
@@ -9863,7 +9384,6 @@
           </w:tcPr>
           <w:p>
             <w:pPr>
-              <w:keepNext w:val="0"/>
               <w:spacing w:after="20" w:line="240" w:lineRule="auto"/>
               <w:jc w:val="center"/>
             </w:pPr>
@@ -9889,7 +9409,6 @@
           </w:tcPr>
           <w:p>
             <w:pPr>
-              <w:keepNext w:val="0"/>
               <w:spacing w:after="20" w:line="240" w:lineRule="auto"/>
               <w:jc w:val="center"/>
             </w:pPr>
@@ -9915,7 +9434,6 @@
           </w:tcPr>
           <w:p>
             <w:pPr>
-              <w:keepNext w:val="0"/>
               <w:spacing w:after="20" w:line="240" w:lineRule="auto"/>
               <w:jc w:val="center"/>
             </w:pPr>
@@ -9941,7 +9459,6 @@
           </w:tcPr>
           <w:p>
             <w:pPr>
-              <w:keepNext w:val="0"/>
               <w:spacing w:after="20" w:line="240" w:lineRule="auto"/>
               <w:jc w:val="center"/>
             </w:pPr>
@@ -9973,7 +9490,6 @@
           </w:tcPr>
           <w:p>
             <w:pPr>
-              <w:keepNext w:val="0"/>
               <w:spacing w:after="20" w:line="240" w:lineRule="auto"/>
             </w:pPr>
             <w:r>
@@ -9998,7 +9514,6 @@
           </w:tcPr>
           <w:p>
             <w:pPr>
-              <w:keepNext w:val="0"/>
               <w:spacing w:after="20" w:line="240" w:lineRule="auto"/>
               <w:jc w:val="center"/>
             </w:pPr>
@@ -10024,7 +9539,6 @@
           </w:tcPr>
           <w:p>
             <w:pPr>
-              <w:keepNext w:val="0"/>
               <w:spacing w:after="20" w:line="240" w:lineRule="auto"/>
               <w:jc w:val="center"/>
             </w:pPr>
@@ -10050,7 +9564,6 @@
           </w:tcPr>
           <w:p>
             <w:pPr>
-              <w:keepNext w:val="0"/>
               <w:spacing w:after="20" w:line="240" w:lineRule="auto"/>
               <w:jc w:val="center"/>
             </w:pPr>
@@ -10076,7 +9589,6 @@
           </w:tcPr>
           <w:p>
             <w:pPr>
-              <w:keepNext w:val="0"/>
               <w:spacing w:after="20" w:line="240" w:lineRule="auto"/>
               <w:jc w:val="center"/>
             </w:pPr>
@@ -10102,7 +9614,6 @@
           </w:tcPr>
           <w:p>
             <w:pPr>
-              <w:keepNext w:val="0"/>
               <w:spacing w:after="20" w:line="240" w:lineRule="auto"/>
               <w:jc w:val="center"/>
             </w:pPr>
@@ -10134,7 +9645,6 @@
           </w:tcPr>
           <w:p>
             <w:pPr>
-              <w:keepNext w:val="0"/>
               <w:spacing w:after="20" w:line="240" w:lineRule="auto"/>
             </w:pPr>
             <w:r>
@@ -10159,7 +9669,6 @@
           </w:tcPr>
           <w:p>
             <w:pPr>
-              <w:keepNext w:val="0"/>
               <w:spacing w:after="20" w:line="240" w:lineRule="auto"/>
               <w:jc w:val="center"/>
             </w:pPr>
@@ -10185,7 +9694,6 @@
           </w:tcPr>
           <w:p>
             <w:pPr>
-              <w:keepNext w:val="0"/>
               <w:spacing w:after="20" w:line="240" w:lineRule="auto"/>
               <w:jc w:val="center"/>
             </w:pPr>
@@ -10211,7 +9719,6 @@
           </w:tcPr>
           <w:p>
             <w:pPr>
-              <w:keepNext w:val="0"/>
               <w:spacing w:after="20" w:line="240" w:lineRule="auto"/>
               <w:jc w:val="center"/>
             </w:pPr>
@@ -10237,7 +9744,6 @@
           </w:tcPr>
           <w:p>
             <w:pPr>
-              <w:keepNext w:val="0"/>
               <w:spacing w:after="20" w:line="240" w:lineRule="auto"/>
               <w:jc w:val="center"/>
             </w:pPr>
@@ -10263,7 +9769,6 @@
           </w:tcPr>
           <w:p>
             <w:pPr>
-              <w:keepNext w:val="0"/>
               <w:spacing w:after="20" w:line="240" w:lineRule="auto"/>
               <w:jc w:val="center"/>
             </w:pPr>
@@ -10295,7 +9800,6 @@
           </w:tcPr>
           <w:p>
             <w:pPr>
-              <w:keepNext w:val="0"/>
               <w:spacing w:after="20" w:line="240" w:lineRule="auto"/>
             </w:pPr>
             <w:r>
@@ -10320,7 +9824,6 @@
           </w:tcPr>
           <w:p>
             <w:pPr>
-              <w:keepNext w:val="0"/>
               <w:spacing w:after="20" w:line="240" w:lineRule="auto"/>
               <w:jc w:val="center"/>
             </w:pPr>
@@ -10346,7 +9849,6 @@
           </w:tcPr>
           <w:p>
             <w:pPr>
-              <w:keepNext w:val="0"/>
               <w:spacing w:after="20" w:line="240" w:lineRule="auto"/>
               <w:jc w:val="center"/>
             </w:pPr>
@@ -10372,7 +9874,6 @@
           </w:tcPr>
           <w:p>
             <w:pPr>
-              <w:keepNext w:val="0"/>
               <w:spacing w:after="20" w:line="240" w:lineRule="auto"/>
               <w:jc w:val="center"/>
             </w:pPr>
@@ -10398,7 +9899,6 @@
           </w:tcPr>
           <w:p>
             <w:pPr>
-              <w:keepNext w:val="0"/>
               <w:spacing w:after="20" w:line="240" w:lineRule="auto"/>
               <w:jc w:val="center"/>
             </w:pPr>
@@ -10424,7 +9924,6 @@
           </w:tcPr>
           <w:p>
             <w:pPr>
-              <w:keepNext w:val="0"/>
               <w:spacing w:after="20" w:line="240" w:lineRule="auto"/>
               <w:jc w:val="center"/>
             </w:pPr>
@@ -10445,13 +9944,16 @@
     </w:p>
     <w:p>
       <w:r>
-        <w:t>Tables 6 and 7 each report 30 matched histories per row. Intervals are pointwise and conditional on the frozen model. A point pass requires an absolute error of at most 15%; interval containment is reported in the accompanying CSV and is not the primary acceptance rule.</w:t>
+        <w:t xml:space="preserve">Tables 6 and 7 each report 30 matched histories per row. Intervals are pointwise and conditional on the frozen model. A point pass requires an absolute error of at most 15%; </w:t>
+      </w:r>
+      <w:r>
+        <w:lastRenderedPageBreak/>
+        <w:t>interval containment is reported in the accompanying CSV and is not the primary acceptance rule.</w:t>
       </w:r>
     </w:p>
     <w:p>
       <w:pPr>
         <w:pStyle w:val="Heading2"/>
-        <w:keepNext/>
       </w:pPr>
       <w:r>
         <w:t>4.5 Process isolation sensitivity</w:t>
@@ -10481,7 +9983,6 @@
         <w:rPr>
           <w:noProof/>
         </w:rPr>
-        <w:lastRenderedPageBreak/>
         <w:drawing>
           <wp:inline distT="0" distB="0" distL="0" distR="0" wp14:anchorId="55E46874" wp14:editId="36880E52">
             <wp:extent cx="4343400" cy="3378200"/>
@@ -10538,7 +10039,6 @@
     <w:p>
       <w:pPr>
         <w:pStyle w:val="Heading2"/>
-        <w:keepNext/>
       </w:pPr>
       <w:r>
         <w:t>4.6 Secondary artifact integrity example</w:t>
@@ -10546,18 +10046,16 @@
     </w:p>
     <w:p>
       <w:r>
-        <w:rPr/>
-        <w:t>The retained MHEALTH example is limited to functional artifact checks. The example uses the public MHEALTH dataset [10], whose associated introductory publication describes mHealthDroid [11]. The retained workflow contains 5,000 selected sensor windows and five derived pipeline artifacts. The original package records 12/12 successful mutation checks across N, E and D: changed payload bytes are detected by the separate payload audit, while altered signed references and missing predecessors are rejected by evidence verification. These are historical functional fixtures and do not enter the fresh timing analysis. Classification accuracy, stair-climbing recall and subject-level generalization are omitted as evidence for the latency question. There is no claim of clinical utility, device validation or authenticated physiological acquisition.</w:t>
+        <w:t xml:space="preserve">The retained MHEALTH example is limited to functional artifact checks. The example uses the public MHEALTH dataset [10], whose associated introductory publication describes </w:t>
       </w:r>
-      <w:proofErr w:type="spellStart"/>
-      <w:proofErr w:type="spellEnd"/>
-      <w:proofErr w:type="spellStart"/>
-      <w:proofErr w:type="spellEnd"/>
+      <w:r>
+        <w:lastRenderedPageBreak/>
+        <w:t>mHealthDroid [11]. The retained workflow contains 5,000 selected sensor windows and five derived pipeline artifacts. The original package records 12/12 successful mutation checks across N, E and D: changed payload bytes are detected by the separate payload audit, while altered signed references and missing predecessors are rejected by evidence verification. These are historical functional fixtures and do not enter the fresh timing analysis. Classification accuracy, stair-climbing recall and subject-level generalization are omitted as evidence for the latency question. There is no claim of clinical utility, device validation or authenticated physiological acquisition.</w:t>
+      </w:r>
     </w:p>
     <w:p>
       <w:pPr>
         <w:pStyle w:val="Heading1"/>
-        <w:keepNext/>
       </w:pPr>
       <w:r>
         <w:t>5 Discussion</w:t>
@@ -10565,33 +10063,28 @@
     </w:p>
     <w:p>
       <w:r>
-        <w:rPr/>
         <w:t>The revised experiment separates accounting correctness from timing prediction. Byte and operation ledgers can be exact while their cost coefficients omit work or aggregate it at the wrong level. Complete-query fitting incorporates canonical manifest validation and fixed setup costs that a primitive-only model can miss. The comparison with equally trained bytes-only and affine baselines makes the predictive claim assessable; the ablations test whether the additional terms are useful within this workload.</w:t>
       </w:r>
     </w:p>
     <w:p/>
     <w:p>
       <w:r>
-        <w:rPr/>
         <w:t>Under the declared criterion, the corrected model met the primary performance requirements in balanced mode. Its isolated-mode result must be read alongside that finding because a capacity estimate can change when process reuse changes. A practical use is to estimate verification time for the same envelope, library build and cache profile after local calibration. The results do not establish portability to another parser, signature implementation, batch size, cold-cache service or storage system.</w:t>
       </w:r>
     </w:p>
     <w:p>
       <w:r>
-        <w:rPr/>
         <w:t>The timer fix is necessary for a clean measurement boundary, but the study does not attribute every improvement to that fix. The model form, fitting evidence, weighting, process priming, garbage collection and query schedule also changed. Thus the experiment evaluates the revised pipeline as a whole. A causal estimate of the timer defect alone would require a separately controlled intervention with all other conditions held fixed.</w:t>
       </w:r>
     </w:p>
     <w:p>
       <w:r>
-        <w:rPr/>
         <w:t>The contribution is empirical and methodological. Tree batching and signature renewal explain the storage reduction without requiring a new theory. The additional evidence comes from testing whether a workload-aware affine model, frozen after development, transfers to ten times the largest development archive and to a separately reported process-isolation mode. The resulting claim concerns measured prediction accuracy for this implementation and workload.</w:t>
       </w:r>
     </w:p>
     <w:p>
       <w:pPr>
         <w:pStyle w:val="Heading2"/>
-        <w:keepNext/>
       </w:pPr>
       <w:r>
         <w:t>5.1 Limitations</w:t>
@@ -10599,39 +10092,32 @@
     </w:p>
     <w:p>
       <w:r>
-        <w:rPr/>
         <w:t>Development and evaluation used different archive sizes in sequential phases, so scale and collection time are not independently randomized. One virtualized host cannot establish cross-platform performance, dedicated-host reproducibility or tail-latency service guarantees. Each history contributes one timed observation per condition and mode. Bootstrap intervals are conditional on the fitted coefficients and pointwise across the fixed grid. They omit development-fit uncertainty and do not provide simultaneous coverage.</w:t>
       </w:r>
     </w:p>
     <w:p>
       <w:r>
-        <w:rPr/>
+        <w:lastRenderedPageBreak/>
         <w:t>The protocol was informed by the earlier failure and used a previously exercised evaluation scale. The preserved private snapshot strengthens the record of what was fixed before the new measurements, but it is neither public preregistration nor a trusted timestamp. Independent replication is needed to assess performance beyond this execution environment. The exact source of the interrupted workspace archive-size mismatch was not independently diagnosed; all provisional development data were excluded.</w:t>
       </w:r>
     </w:p>
     <w:p>
       <w:r>
-        <w:rPr/>
         <w:t>The declared retention rule discards full archives and full query proofs after their measurements to bound disk use. The approximately 4 GiB retention limit kept metadata, logs, model inputs and 486 selective proofs but did not retain every generated archive and proof. It originated under this allowance and was carried forward on the current host. The saved materials support reanalysis and direct reverification of the retained subset; regenerating discarded material permits a new execution but cannot recover the original randomized signatures for complete historical reverification.</w:t>
       </w:r>
     </w:p>
     <w:p>
       <w:r>
-        <w:rPr/>
         <w:t>The security evaluation covers explicit adversarial fixtures under honest enrollment and a modeled clock. Physical durability, source authentication, common-mode failures and production hardening remain untested. The MHEALTH example inherits the limitations of secondary public-data reuse and is not a clinical study.</w:t>
       </w:r>
     </w:p>
     <w:p>
       <w:pPr>
         <w:pStyle w:val="Heading2"/>
-        <w:keepNext/>
         <w:spacing w:after="100"/>
       </w:pPr>
       <w:r>
         <w:rPr>
-          <w:rFonts w:ascii="Times New Roman" w:hAnsi="Times New Roman"/>
-          <w:b/>
-          <w:color w:val="000000"/>
           <w:sz w:val="20"/>
         </w:rPr>
         <w:t>5.2 Generalization and adaptation</w:t>
@@ -10642,10 +10128,6 @@
         <w:spacing w:after="100"/>
       </w:pPr>
       <w:r>
-        <w:rPr>
-          <w:rFonts w:ascii="Times New Roman" w:hAnsi="Times New Roman"/>
-          <w:sz w:val="20"/>
-        </w:rPr>
         <w:t>The calibration procedure and explicit accounting of verification work can be adapted to other systems. The numerical coefficients are specific to the tested AMD EPYC host, cryptographic builds, fixed-width envelope and warm-cache endpoint. Different instruction sets, parser behavior and cryptographic optimizations can change the relative costs of individual terms; a single hardware speed multiplier is not established. Production storage may add costs absent from this measurement boundary. The current results demonstrate scale extrapolation and process-isolation sensitivity within one environment rather than cross-platform validation.</w:t>
       </w:r>
     </w:p>
@@ -10654,24 +10136,16 @@
         <w:spacing w:after="100"/>
       </w:pPr>
       <w:r>
-        <w:rPr>
-          <w:rFonts w:ascii="Times New Roman" w:hAnsi="Times New Roman"/>
-          <w:sz w:val="20"/>
-        </w:rPr>
         <w:t>Practitioners should first define the verification request, acceptance policy and timing endpoint, then instrument the target verifier and reconcile its counts against an independent ledger. Retain the seven terms only when they describe that verifier’s work. Variable-size records, certificate-path validation, revocation processing or timestamp checks may require other terms. Collect representative development histories, fit the relative-error objective in Section 3.4 and check rank, conditioning and residuals by workload. Freeze the features, coefficients and acceptance rule before testing fresh histories. Recalibrate after material environment changes. The present median-error criterion does not establish a production tail-latency guarantee.</w:t>
       </w:r>
     </w:p>
     <w:p>
       <w:pPr>
         <w:pStyle w:val="Heading2"/>
-        <w:keepNext/>
         <w:spacing w:after="100"/>
       </w:pPr>
       <w:r>
         <w:rPr>
-          <w:rFonts w:ascii="Times New Roman" w:hAnsi="Times New Roman"/>
-          <w:b/>
-          <w:color w:val="000000"/>
           <w:sz w:val="20"/>
         </w:rPr>
         <w:t>5.3 Cold-cache verification and network retrieval</w:t>
@@ -10682,17 +10156,16 @@
         <w:spacing w:after="100"/>
       </w:pPr>
       <w:r>
-        <w:rPr>
-          <w:rFonts w:ascii="Times New Roman" w:hAnsi="Times New Roman"/>
-          <w:sz w:val="20"/>
-        </w:rPr>
-        <w:t>Future evaluation should distinguish warm-cache verification, cold local retrieval and remote storage access, with explicit reporting of client, operating-system and storage caches. Restarting a worker alone does not establish cold caches. Service experiments should record end-to-end elapsed time alongside retrieval, proof-construction and verification spans, plus concurrency, transferred bytes and network conditions. Overlapping stages require tracing that accounts for overlap rather than simple addition. Warm-cache local reads already occur inside the current timer and should not be counted twice in an extended model. These scenarios remain future work; no cold-cache or network-service performance is claimed here.</w:t>
+        <w:t xml:space="preserve">Future evaluation should distinguish warm-cache verification, cold local retrieval and remote storage access, with explicit reporting of client, operating-system and storage caches. Restarting a worker alone does not establish cold caches. Service experiments should record end-to-end elapsed time alongside retrieval, proof-construction and verification spans, plus concurrency, transferred bytes and network conditions. Overlapping stages require tracing that accounts for overlap rather than simple addition. Warm-cache local reads already occur inside the current timer and should not be counted twice in an </w:t>
+      </w:r>
+      <w:r>
+        <w:lastRenderedPageBreak/>
+        <w:t>extended model. These scenarios remain future work; no cold-cache or network-service performance is claimed here.</w:t>
       </w:r>
     </w:p>
     <w:p>
       <w:pPr>
         <w:pStyle w:val="Heading1"/>
-        <w:keepNext/>
       </w:pPr>
       <w:r>
         <w:t>6 Conclusions</w:t>
@@ -10706,7 +10179,6 @@
     <w:p>
       <w:pPr>
         <w:pStyle w:val="Heading1"/>
-        <w:keepNext/>
       </w:pPr>
       <w:r>
         <w:t>Declarations</w:t>
@@ -10723,9 +10195,6 @@
         <w:t xml:space="preserve">Funding: </w:t>
       </w:r>
       <w:r>
-        <w:rPr>
-          <w:b w:val="0"/>
-        </w:rPr>
         <w:t>No funding was received for this work.</w:t>
       </w:r>
     </w:p>
@@ -10740,9 +10209,6 @@
         <w:t xml:space="preserve">Conflict of interest/Competing interests: </w:t>
       </w:r>
       <w:r>
-        <w:rPr>
-          <w:b w:val="0"/>
-        </w:rPr>
         <w:t>The authors declare no competing interests.</w:t>
       </w:r>
     </w:p>
@@ -10757,9 +10223,6 @@
         <w:t xml:space="preserve">Ethics approval and consent to participate: </w:t>
       </w:r>
       <w:r>
-        <w:rPr>
-          <w:b w:val="0"/>
-        </w:rPr>
         <w:t>No new experiments involving live vertebrates, humans or human tissue samples were conducted for this study. The only human-derived data used are the publicly available, de-identified MHEALTH dataset (DOI: 10.24432/C5TW22), reused here solely for functional artifact-integrity checks rather than clinical or physiological analysis, under its original public release terms. No formal institutional ethics or IRB review was sought or required, as this study involved no new experiments on live vertebrates, humans or human tissue and relied solely on reuse of already-public, de-identified secondary data.</w:t>
       </w:r>
     </w:p>
@@ -10774,9 +10237,6 @@
         <w:t xml:space="preserve">Consent for publication: </w:t>
       </w:r>
       <w:r>
-        <w:rPr>
-          <w:b w:val="0"/>
-        </w:rPr>
         <w:t>Not applicable — this manuscript does not include any individual person's identifying data, images or videos.</w:t>
       </w:r>
     </w:p>
@@ -10791,10 +10251,35 @@
         <w:t xml:space="preserve">Data availability: </w:t>
       </w:r>
       <w:r>
-        <w:rPr>
-          <w:b w:val="0"/>
-        </w:rPr>
-        <w:t>The research supplement accompanying this revision contains the existing version 4.2 development and evaluation timing rows, history records, fitted coefficients, analysis outputs, audit logs and retained selective proofs with enrollment policies. In the accompanying vital-q reproducibility repository, original timing rows, analyses, audit records and proofs are under data/published; frozen coefficients are under src/release. Full archives and full-query proofs were discarded under the retention rule described in Section 5.1. The repository is public at https://github.com/bdata-arindam/VITAL-Q; release v1 is the reproducibility package and release v2 adds this manuscript with the response to the reviewers. The secondary MHEALTH dataset is publicly available at https://doi.org/10.24432/C5TW22 [10].</w:t>
+        <w:t>The research supplement accompanying this revision contains the existing version 4.2 development and evaluation timing rows, history records, fitted coefficients, analysis outputs, audit logs and retained selective proofs with enrollment policies. In the accompanying vital-q reproducibility repository, original timing rows, analyses, audit records and proofs are under data/published; frozen coefficients are under src/release. Full archives and full-query proofs were discarded under the retention rule described in Section 5.1. The repository is public at https://github.com/</w:t>
+      </w:r>
+      <w:r>
+        <w:t xml:space="preserve"> </w:t>
+      </w:r>
+      <w:proofErr w:type="spellStart"/>
+      <w:r>
+        <w:t>discoversaikatchakraborty</w:t>
+      </w:r>
+      <w:proofErr w:type="spellEnd"/>
+      <w:r>
+        <w:t>/VITAL-Q; release v</w:t>
+      </w:r>
+      <w:r>
+        <w:t>3 (</w:t>
+      </w:r>
+      <w:hyperlink r:id="rId9" w:history="1">
+        <w:r>
+          <w:rPr>
+            <w:rStyle w:val="Hyperlink"/>
+          </w:rPr>
+          <w:t>https://doi.org/10.5281/zenodo.23329917</w:t>
+        </w:r>
+      </w:hyperlink>
+      <w:r>
+        <w:t xml:space="preserve">) </w:t>
+      </w:r>
+      <w:r>
+        <w:t xml:space="preserve"> is the reproducibility package and release v2 adds this manuscript with the response to the reviewers. The secondary MHEALTH dataset is publicly available at https://doi.org/10.24432/C5TW22 [10].</w:t>
       </w:r>
     </w:p>
     <w:p>
@@ -10808,9 +10293,6 @@
         <w:t xml:space="preserve">Materials availability: </w:t>
       </w:r>
       <w:r>
-        <w:rPr>
-          <w:b w:val="0"/>
-        </w:rPr>
         <w:t>Not applicable — this study did not generate or use physical laboratory materials or reagents.</w:t>
       </w:r>
     </w:p>
@@ -10825,11 +10307,102 @@
         <w:t xml:space="preserve">Code availability: </w:t>
       </w:r>
       <w:r>
+        <w:t xml:space="preserve">The research supplement contains the existing verifier, archive builder, timing helpers, calibration, model fitting and analysis code under src/release in the accompanying vital-q repository. The repository also includes executed analysis and control notebooks, plotting code, dependency information and instructions for numerical replay, </w:t>
+      </w:r>
+      <w:r>
+        <w:lastRenderedPageBreak/>
+        <w:t>retained-proof verification and a fresh full-scale run. The portable driver uses local checkpoints; the original study used the hosted snapshots described in Section 3.3. A separately recorded fresh execution is included under executions/full_scale_20261012; it does not replace this manuscript’s original measurements. Code and data are supplied together in the public repository https://github.com/</w:t>
+      </w:r>
+      <w:r>
+        <w:t>discoversaikatchakraborty</w:t>
+      </w:r>
+      <w:r>
+        <w:t>/VITAL-Q, released as v</w:t>
+      </w:r>
+      <w:r>
+        <w:t>3 (</w:t>
+      </w:r>
+      <w:hyperlink r:id="rId10" w:history="1">
+        <w:r>
+          <w:rPr>
+            <w:rStyle w:val="Hyperlink"/>
+          </w:rPr>
+          <w:t>https://doi.org/10.5281/zenodo.23329917</w:t>
+        </w:r>
+      </w:hyperlink>
+      <w:r>
+        <w:t xml:space="preserve"> )</w:t>
+      </w:r>
+      <w:r>
+        <w:t xml:space="preserve"> for the package with v2 adding the manuscript materials.</w:t>
+      </w:r>
+    </w:p>
+    <w:p>
+      <w:pPr>
+        <w:pStyle w:val="acknowlegments"/>
         <w:rPr>
-          <w:b w:val="0"/>
+          <w:rFonts w:cstheme="minorBidi"/>
+          <w:color w:val="000000"/>
+          <w:sz w:val="20"/>
         </w:rPr>
-        <w:t>The research supplement contains the existing verifier, archive builder, timing helpers, calibration, model fitting and analysis code under src/release in the accompanying vital-q repository. The repository also includes executed analysis and control notebooks, plotting code, dependency information and instructions for numerical replay, retained-proof verification and a fresh full-scale run. The portable driver uses local checkpoints; the original study used the hosted snapshots described in Section 3.3. A separately recorded fresh execution is included under executions/full_scale_20261012; it does not replace this manuscript’s original measurements. Code and data are supplied together in the public repository https://github.com/bdata-arindam/VITAL-Q, released as v1 for the package with v2 adding the manuscript materials.</w:t>
+      </w:pPr>
+      <w:r>
+        <w:rPr>
+          <w:rFonts w:cstheme="minorBidi"/>
+          <w:b/>
+          <w:bCs/>
+          <w:color w:val="000000"/>
+          <w:sz w:val="20"/>
+        </w:rPr>
+        <w:t>Use of generative AI or AI-assisted technologies in manuscript preparation</w:t>
       </w:r>
+      <w:r>
+        <w:rPr>
+          <w:rFonts w:cstheme="minorBidi"/>
+          <w:b/>
+          <w:bCs/>
+          <w:color w:val="000000"/>
+          <w:sz w:val="20"/>
+        </w:rPr>
+        <w:t>:</w:t>
+      </w:r>
+      <w:r>
+        <w:rPr>
+          <w:rFonts w:cstheme="minorBidi"/>
+          <w:color w:val="000000"/>
+          <w:sz w:val="20"/>
+        </w:rPr>
+        <w:t xml:space="preserve"> </w:t>
+      </w:r>
+      <w:r>
+        <w:rPr>
+          <w:rFonts w:cstheme="minorBidi"/>
+          <w:color w:val="000000"/>
+          <w:sz w:val="20"/>
+        </w:rPr>
+        <w:t xml:space="preserve">AI-assisted tools </w:t>
+      </w:r>
+      <w:r>
+        <w:rPr>
+          <w:rFonts w:cstheme="minorBidi"/>
+          <w:color w:val="000000"/>
+          <w:sz w:val="20"/>
+        </w:rPr>
+        <w:t xml:space="preserve">were used </w:t>
+      </w:r>
+      <w:r>
+        <w:rPr>
+          <w:rFonts w:cstheme="minorBidi"/>
+          <w:color w:val="000000"/>
+          <w:sz w:val="20"/>
+        </w:rPr>
+        <w:t>for implementation support, plotting and manuscript editing. Every experimental output, citation, numerical result and interpretation was checked by the authors against the underlying artifacts. AI tools were never treated as a source of empirical evidence and were not permitted to invent or alter experimental results.</w:t>
+      </w:r>
+    </w:p>
+    <w:p>
+      <w:pPr>
+        <w:pStyle w:val="BodyText"/>
+      </w:pPr>
     </w:p>
     <w:p>
       <w:pPr>
@@ -10842,16 +10415,12 @@
         <w:t xml:space="preserve">Author contribution: </w:t>
       </w:r>
       <w:r>
-        <w:rPr>
-          <w:b w:val="0"/>
-        </w:rPr>
         <w:t>A. Chakraborty, S. Chakraborty, S. Marik and S. Dhar jointly conceived and designed the study, developed the software and analysis pipeline, executed the data collection, performed the formal analysis and wrote the manuscript. All authors read and approved the final manuscript.</w:t>
       </w:r>
     </w:p>
     <w:p>
       <w:pPr>
         <w:pStyle w:val="Heading1"/>
-        <w:keepNext/>
       </w:pPr>
       <w:r>
         <w:t>Appendix A Technical appendix</w:t>
@@ -10860,7 +10429,6 @@
     <w:p>
       <w:pPr>
         <w:pStyle w:val="Heading2"/>
-        <w:keepNext/>
       </w:pPr>
       <w:r>
         <w:t>A.1 Evidence encoding and authenticated request</w:t>
@@ -10878,13 +10446,16 @@
     </w:p>
     <w:p>
       <w:r>
-        <w:t>The N design signs individual record subjects. E signs batches of at most 4,096 records using one primary Merkle tree per batch. D signs two independent batch branches: a SHA-256 primary tree and a SHA-384 redundant tree. Leaf hashes include a domain byte, global record identifier and canonical manifest; internal hashes use a distinct domain byte and the ordered children. Odd final nodes are promoted, not duplicated. A selected E or D proof carries only actual path siblings, while a full proof checks all required manifests and tokens and reconstructs roots. The verifier authenticates complete predecessor chains. Missing audit objects are rejected even when another branch could satisfy the policy.</w:t>
+        <w:t xml:space="preserve">The N design signs individual record subjects. E signs batches of at most 4,096 records using one primary Merkle tree per batch. D signs two independent batch branches: a SHA-256 primary tree and a SHA-384 redundant tree. Leaf hashes include a domain byte, global record identifier and canonical manifest; internal hashes use a distinct domain byte and the ordered children. Odd final nodes are promoted, not duplicated. A selected E or D proof carries only actual path siblings, while a full proof checks all required manifests and tokens </w:t>
+      </w:r>
+      <w:r>
+        <w:lastRenderedPageBreak/>
+        <w:t>and reconstructs roots. The verifier authenticates complete predecessor chains. Missing audit objects are rejected even when another branch could satisfy the policy.</w:t>
       </w:r>
     </w:p>
     <w:p>
       <w:pPr>
         <w:pStyle w:val="Heading2"/>
-        <w:keepNext/>
       </w:pPr>
       <w:r>
         <w:t>A.2 Cryptographic operations and policy boundaries</w:t>
@@ -10892,20 +10463,17 @@
     </w:p>
     <w:p>
       <w:r>
-        <w:rPr/>
         <w:t>At generation zero, primary branch tokens use ECDSA P-256 with SHA-256. Subsequent primary generations use ML-DSA-65. D additionally uses SLH-DSA SHA2-192f in its redundant branch. Each generation rotates the key within a branch. The signed token binds a history prefix, branch, generation, subject, modeled issue time, target digest and predecessor digest. Public-key enrollment objects are checked against the externally supplied enrollment policy. Expected issue times follow the modeled epoch plus 100 units per generation; they are simulated policy inputs, not real timestamp authority evidence.</w:t>
       </w:r>
     </w:p>
     <w:p>
       <w:r>
-        <w:rPr/>
         <w:t>A policy-eligible branch must span the requested history and each requested subject must have at least one eligible complete branch. Cryptographic verification still audits all presented required branches. This separates a simulated loss of one signature family from an assertion that the remaining branch proves real-world origin or time. No new signature algorithm, hash function or recovery protocol is proposed. The retained tests exercise the protocol implementation under its stated honest-enrollment assumptions.</w:t>
       </w:r>
     </w:p>
     <w:p>
       <w:pPr>
         <w:pStyle w:val="Heading2"/>
-        <w:keepNext/>
       </w:pPr>
       <w:r>
         <w:t>A.3 Ledger and timing trace</w:t>
@@ -10913,39 +10481,17 @@
     </w:p>
     <w:p>
       <w:r>
-        <w:rPr/>
         <w:t>Every completed history records archive bytes, object counts, signature operations, Merkle-hash operations, barrier events and proof bytes independently of the latency model. Batch counts use k = ceiling(n/4096). With G = R + 1 generations, N requires nG signed record tokens, E kG batch tokens and D 2kG tokens. A selective N or E request checks G tokens; D checks 2G. Archive byte reductions reported in Table 3 compare evidence archives at the same n and R and intentionally exclude payload files. The selective-proof example fixes the observed path at 12 siblings and does not imply that proofs always have that length.</w:t>
       </w:r>
-      <w:proofErr w:type="spellStart"/>
-      <w:proofErr w:type="spellEnd"/>
-      <w:proofErr w:type="spellStart"/>
-      <w:proofErr w:type="spellEnd"/>
     </w:p>
     <w:p>
-      <w:pPr>
-        <w:rPr>
-          <w:b w:val="0"/>
-          <w:bCs w:val="0"/>
-          <w:sz w:val="20"/>
-          <w:szCs w:val="22"/>
-        </w:rPr>
-      </w:pPr>
       <w:r>
-        <w:rPr>
-          <w:b w:val="0"/>
-          <w:bCs w:val="0"/>
-          <w:sz w:val="20"/>
-          <w:szCs w:val="22"/>
-        </w:rPr>
         <w:t>The measured complete-query endpoint opens an already built proof and ends at the verifier acceptance decision, including file reads, parsing, canonical validation, enrollment lookups, hashing and signatures. The timer uses perf_counter_ns. Explicit priming, proof construction and hashing, file warming, worker startup, interprocess communication, forced collection, returned-result checks and disposal occur outside it. The same cache preparation is applied to each query in each mode. A measurement is therefore a warm-cache implementation observation, not a cold storage retrieval or end-to-end network service time.</w:t>
       </w:r>
-      <w:proofErr w:type="spellStart"/>
-      <w:proofErr w:type="spellEnd"/>
     </w:p>
     <w:p>
       <w:pPr>
         <w:pStyle w:val="Heading2"/>
-        <w:keepNext/>
       </w:pPr>
       <w:r>
         <w:t>A.4 Test coverage and evaluation accounting</w:t>
@@ -10953,34 +10499,28 @@
     </w:p>
     <w:p>
       <w:r>
-        <w:rPr/>
         <w:t>The retained execution records contain 162 successfully reconciled histories and a separate 233/233 verifier test record. Tests cover valid and tampered signatures, wrong keys, malformed framing, enrollment mismatch, altered requested identity, missing chain predecessors, tree boundaries and logical crash prefixes. The final audit confirms 162 archive ledgers and 486 retained selective proofs. The two timer tests separately check stop-clock order and the lifetime of the previous returned object. These counts measure implemented checks; they are not a formal security proof or a physical power-loss experiment.</w:t>
       </w:r>
-      <w:proofErr w:type="gramStart"/>
-      <w:proofErr w:type="gramEnd"/>
     </w:p>
     <w:p>
       <w:r>
-        <w:rPr/>
+        <w:lastRenderedPageBreak/>
         <w:t>The fixed evaluation grid has three designs, two query modes and three renewal counts: 18 conditions per timing mode. Every condition receives 30 matched evaluation observations. Ninety evaluation histories therefore give 1,080 timed observations, while 72 development histories supply 864. Balanced mode and fresh-process isolated mode are recorded for each history. The six-task schedule balances 36 position cells and 30 ordered predecessor pairs within each design; the audit found five observations for each relevant position and predecessor pair.</w:t>
       </w:r>
     </w:p>
     <w:p>
       <w:r>
-        <w:rPr/>
         <w:t>The fitted coefficients are nonnegative and use the 36 balanced development cell medians, each from 12 observations. Dividing each row by its observed median time makes the objective relative rather than dominated by large full-query times. The affine intercept captures fixed setup at this measurement endpoint; record count captures validated manifests. Signature-family counts, enrollment objects and internal Merkle hashes capture the remaining measured workload. These regressors can correlate and no coefficient should be read as a separately randomized causal operation cost. The equally trained ablations in Table 5 isolate predictive utility within the chosen model class.</w:t>
       </w:r>
     </w:p>
     <w:p>
       <w:r>
-        <w:rPr/>
         <w:t>The supplied raw rows, frozen model JSON, six-cell executed analysis notebook, tabular evaluation CSV and figure permit numerical replay without rerunning the roughly two-hour cryptographic collection. The notebook reconstructs the development fit and compares all evaluation cells and conditional bootstrap intervals. It does not re-create randomized signatures or lost full archives. The supplied selective proofs and policies permit rechecking that retained subset directly; exact historical full-proof verification needs bytes deliberately discarded under the retention rule.</w:t>
       </w:r>
     </w:p>
     <w:p>
       <w:pPr>
         <w:pStyle w:val="Heading1"/>
-        <w:keepNext/>
       </w:pPr>
       <w:r>
         <w:t>References</w:t>
@@ -11023,6 +10563,7 @@
     </w:p>
     <w:p>
       <w:r>
+        <w:lastRenderedPageBreak/>
         <w:t>8. Moreau, L., Missier, P. (eds.): PROV-DM: The PROV Data Model. W3C Recommendation (2013)</w:t>
       </w:r>
     </w:p>
@@ -11042,37 +10583,22 @@
       </w:r>
     </w:p>
     <w:p>
-      <w:pPr/>
       <w:r>
-        <w:rPr>
-          <w:rFonts w:ascii="Times New Roman" w:hAnsi="Times New Roman"/>
-          <w:sz w:val="20"/>
-        </w:rPr>
         <w:t>12. Adams, C., Cain, P., Pinkas, D., Zuccherato, R.: Internet X.509 Public Key Infrastructure Time-Stamp Protocol (TSP). RFC 3161 (2001). https://doi.org/10.17487/RFC3161</w:t>
       </w:r>
     </w:p>
     <w:p>
-      <w:pPr/>
       <w:r>
-        <w:rPr>
-          <w:rFonts w:ascii="Times New Roman" w:hAnsi="Times New Roman"/>
-          <w:sz w:val="20"/>
-        </w:rPr>
         <w:t>13. Williams, E.J.: Experimental Designs Balanced for the Estimation of Residual Effects of Treatments. Australian Journal of Scientific Research Series A: Physical Sciences 2(2), 149–168 (1949). https://doi.org/10.1071/CH9490149</w:t>
       </w:r>
     </w:p>
     <w:p>
-      <w:pPr/>
       <w:r>
-        <w:rPr>
-          <w:rFonts w:ascii="Times New Roman" w:hAnsi="Times New Roman"/>
-          <w:sz w:val="20"/>
-        </w:rPr>
         <w:t>14. SciPy community: scipy.optimize.nnls. SciPy v1.17.0 Manual. https://docs.scipy.org/doc/scipy-1.17.0/reference/generated/scipy.optimize.nnls.html. Accessed 12 Oct 2026</w:t>
       </w:r>
     </w:p>
     <w:sectPr>
-      <w:footerReference w:type="default" r:id="rId9"/>
+      <w:footerReference w:type="default" r:id="rId11"/>
       <w:pgSz w:w="11906" w:h="16838"/>
       <w:pgMar w:top="1901" w:right="2247" w:bottom="3357" w:left="2247" w:header="720" w:footer="720" w:gutter="0"/>
       <w:cols w:space="720"/>
@@ -22731,6 +22257,51 @@
     <w:basedOn w:val="DefaultParagraphFont"/>
     <w:rsid w:val="008729EE"/>
   </w:style>
+  <w:style w:type="character" w:styleId="Hyperlink">
+    <w:name w:val="Hyperlink"/>
+    <w:basedOn w:val="DefaultParagraphFont"/>
+    <w:uiPriority w:val="99"/>
+    <w:unhideWhenUsed/>
+    <w:rsid w:val="005F1DD4"/>
+    <w:rPr>
+      <w:color w:val="0000FF" w:themeColor="hyperlink"/>
+      <w:u w:val="single"/>
+    </w:rPr>
+  </w:style>
+  <w:style w:type="character" w:styleId="UnresolvedMention">
+    <w:name w:val="Unresolved Mention"/>
+    <w:basedOn w:val="DefaultParagraphFont"/>
+    <w:uiPriority w:val="99"/>
+    <w:semiHidden/>
+    <w:unhideWhenUsed/>
+    <w:rsid w:val="005F1DD4"/>
+    <w:rPr>
+      <w:color w:val="605E5C"/>
+      <w:shd w:val="clear" w:color="auto" w:fill="E1DFDD"/>
+    </w:rPr>
+  </w:style>
+  <w:style w:type="character" w:customStyle="1" w:styleId="heading30">
+    <w:name w:val="heading3"/>
+    <w:rsid w:val="005A1FC6"/>
+    <w:rPr>
+      <w:b/>
+    </w:rPr>
+  </w:style>
+  <w:style w:type="paragraph" w:customStyle="1" w:styleId="acknowlegments">
+    <w:name w:val="acknowlegments"/>
+    <w:basedOn w:val="Normal"/>
+    <w:qFormat/>
+    <w:rsid w:val="005A1FC6"/>
+    <w:pPr>
+      <w:spacing w:before="240" w:line="220" w:lineRule="atLeast"/>
+      <w:jc w:val="both"/>
+    </w:pPr>
+    <w:rPr>
+      <w:rFonts w:cs="Times New Roman"/>
+      <w:color w:val="auto"/>
+      <w:sz w:val="18"/>
+    </w:rPr>
+  </w:style>
 </w:styles>
 </file>
 

</xml_diff>